<commit_message>
docs: rewrite site prose and preserve previous page versions
</commit_message>
<xml_diff>
--- a/docs/word/KORUS.docx
+++ b/docs/word/KORUS.docx
@@ -28,7 +28,7 @@
         </w:p>
       </w:sdtContent>
     </w:sdt>
-    <w:bookmarkStart w:id="50" w:name="X382953dc9020c52bd9e5db31c5a25e22d4afae5"/>
+    <w:bookmarkStart w:id="53" w:name="X382953dc9020c52bd9e5db31c5a25e22d4afae5"/>
     <w:p>
       <w:pPr>
         <w:pStyle w:val="Heading1"/>
@@ -39,14 +39,38 @@
     </w:p>
     <w:p>
       <w:pPr>
-        <w:pStyle w:val="BlockText"/>
-      </w:pPr>
-      <w:r>
-        <w:rPr>
-          <w:b/>
-          <w:bCs/>
-        </w:rPr>
-        <w:t xml:space="preserve">Take a copy:</w:t>
+        <w:pStyle w:val="FirstParagraph"/>
+      </w:pPr>
+      <w:r>
+        <w:t xml:space="preserve">KORUS is the method I developed while using Claude Code on MessageFoundry.org, a major project I</w:t>
+      </w:r>
+      <w:r>
+        <w:t xml:space="preserve"> </w:t>
+      </w:r>
+      <w:r>
+        <w:t xml:space="preserve">started in late May, 2026. I'm a senior developer, and this account records what I learned through that work.</w:t>
+      </w:r>
+    </w:p>
+    <w:p>
+      <w:pPr>
+        <w:pStyle w:val="BodyText"/>
+      </w:pPr>
+      <w:r>
+        <w:t xml:space="preserve">The name means Keep One Repo, Unblock Sessions. I use separate coding sessions with clear jobs,</w:t>
+      </w:r>
+      <w:r>
+        <w:t xml:space="preserve"> </w:t>
+      </w:r>
+      <w:r>
+        <w:t xml:space="preserve">shared records, and checks that stop them disrupting each other's work.</w:t>
+      </w:r>
+    </w:p>
+    <w:p>
+      <w:pPr>
+        <w:pStyle w:val="BodyText"/>
+      </w:pPr>
+      <w:r>
+        <w:t xml:space="preserve">You can</w:t>
       </w:r>
       <w:r>
         <w:t xml:space="preserve"> </w:t>
@@ -56,14 +80,14 @@
           <w:rPr>
             <w:rStyle w:val="Hyperlink"/>
           </w:rPr>
-          <w:t xml:space="preserve">markdown</w:t>
+          <w:t xml:space="preserve">download this Markdown</w:t>
         </w:r>
       </w:hyperlink>
       <w:r>
         <w:t xml:space="preserve"> </w:t>
       </w:r>
       <w:r>
-        <w:t xml:space="preserve">or</w:t>
+        <w:t xml:space="preserve">or read the</w:t>
       </w:r>
       <w:r>
         <w:t xml:space="preserve"> </w:t>
@@ -73,98 +97,55 @@
           <w:rPr>
             <w:rStyle w:val="Hyperlink"/>
           </w:rPr>
-          <w:t xml:space="preserve">Word document</w:t>
+          <w:t xml:space="preserve">Word version</w:t>
         </w:r>
       </w:hyperlink>
       <w:r>
         <w:t xml:space="preserve">.</w:t>
       </w:r>
+      <w:r>
+        <w:t xml:space="preserve"> </w:t>
+      </w:r>
+      <w:r>
+        <w:t xml:space="preserve">The</w:t>
+      </w:r>
+      <w:r>
+        <w:t xml:space="preserve"> </w:t>
+      </w:r>
+      <w:hyperlink r:id="rId11">
+        <w:r>
+          <w:rPr>
+            <w:rStyle w:val="Hyperlink"/>
+          </w:rPr>
+          <w:t xml:space="preserve">previous Word version</w:t>
+        </w:r>
+      </w:hyperlink>
+      <w:r>
+        <w:t xml:space="preserve"> </w:t>
+      </w:r>
+      <w:r>
+        <w:t xml:space="preserve">is also available.</w:t>
+      </w:r>
+    </w:p>
+    <w:p>
+      <w:pPr>
+        <w:pStyle w:val="BodyText"/>
+      </w:pPr>
+    </w:p>
+    <w:bookmarkStart w:id="14" w:name="X07418a353def4e9d778ac597ca1291fde131307"/>
+    <w:p>
+      <w:pPr>
+        <w:pStyle w:val="Heading2"/>
+      </w:pPr>
+      <w:r>
+        <w:t xml:space="preserve">Start with the setup that fits your project</w:t>
+      </w:r>
     </w:p>
     <w:p>
       <w:pPr>
         <w:pStyle w:val="FirstParagraph"/>
       </w:pPr>
-      <w:r>
-        <w:t xml:space="preserve">Hello, I'm a senior developer working on a major project since late May, 2026.</w:t>
-      </w:r>
-      <w:r>
-        <w:t xml:space="preserve"> </w:t>
-      </w:r>
-      <w:r>
-        <w:t xml:space="preserve">(See MessageFoundry.org). This is a personally written summary of what I've learned.</w:t>
-      </w:r>
-    </w:p>
-    <w:p>
-      <w:pPr>
-        <w:pStyle w:val="BodyText"/>
-      </w:pPr>
-      <w:r>
-        <w:t xml:space="preserve">I call it</w:t>
-      </w:r>
-      <w:r>
-        <w:t xml:space="preserve"> </w:t>
-      </w:r>
-      <w:r>
-        <w:rPr>
-          <w:b/>
-          <w:bCs/>
-        </w:rPr>
-        <w:t xml:space="preserve">KORUS: Keep One Repo, Unblock Sessions</w:t>
-      </w:r>
-      <w:r>
-        <w:t xml:space="preserve">. That is the whole idea in four words:</w:t>
-      </w:r>
-      <w:r>
-        <w:t xml:space="preserve"> </w:t>
-      </w:r>
-      <w:r>
-        <w:t xml:space="preserve">everything below follows from keeping one repository and stopping the sessions blocking each other.</w:t>
-      </w:r>
-    </w:p>
-    <w:bookmarkStart w:id="13" w:name="bluftldr"/>
-    <w:p>
-      <w:pPr>
-        <w:pStyle w:val="Heading2"/>
-      </w:pPr>
-      <w:r>
-        <w:t xml:space="preserve">BLUF/TLDR</w:t>
-      </w:r>
-    </w:p>
-    <w:p>
-      <w:pPr>
-        <w:pStyle w:val="FirstParagraph"/>
-      </w:pPr>
-      <w:r>
-        <w:t xml:space="preserve">The following is a framework developed during months of Claude Code work. This document and this</w:t>
-      </w:r>
-      <w:r>
-        <w:t xml:space="preserve"> </w:t>
-      </w:r>
-      <w:r>
-        <w:t xml:space="preserve">site provide a starting point for new projects. This framework contains technical elements</w:t>
-      </w:r>
-      <w:r>
-        <w:t xml:space="preserve"> </w:t>
-      </w:r>
-      <w:r>
-        <w:t xml:space="preserve">supporting better AI coding.</w:t>
-      </w:r>
-    </w:p>
-    <w:p>
-      <w:pPr>
-        <w:pStyle w:val="BodyText"/>
-      </w:pPr>
-      <w:r>
-        <w:rPr>
-          <w:b/>
-          <w:bCs/>
-        </w:rPr>
-        <w:t xml:space="preserve">This page is the reasoning. If you want the commands, they are elsewhere:</w:t>
-      </w:r>
-      <w:r>
-        <w:t xml:space="preserve"> </w:t>
-      </w:r>
-      <w:hyperlink r:id="rId11">
+      <w:hyperlink r:id="rId12">
         <w:r>
           <w:rPr>
             <w:rStyle w:val="Hyperlink"/>
@@ -176,12 +157,12 @@
         <w:t xml:space="preserve"> </w:t>
       </w:r>
       <w:r>
-        <w:t xml:space="preserve">installs the enforcement, and</w:t>
-      </w:r>
-      <w:r>
-        <w:t xml:space="preserve"> </w:t>
-      </w:r>
-      <w:hyperlink r:id="rId12">
+        <w:t xml:space="preserve">installs the controls.</w:t>
+      </w:r>
+      <w:r>
+        <w:t xml:space="preserve"> </w:t>
+      </w:r>
+      <w:hyperlink r:id="rId13">
         <w:r>
           <w:rPr>
             <w:rStyle w:val="Hyperlink"/>
@@ -193,41 +174,39 @@
         <w:t xml:space="preserve"> </w:t>
       </w:r>
       <w:r>
-        <w:t xml:space="preserve">is the operating procedure for the session shape in section 6.</w:t>
-      </w:r>
-    </w:p>
-    <w:p>
-      <w:pPr>
-        <w:pStyle w:val="BodyText"/>
-      </w:pPr>
-      <w:r>
-        <w:rPr>
-          <w:b/>
-          <w:bCs/>
-        </w:rPr>
-        <w:t xml:space="preserve">Last reviewed 2026-08-16.</w:t>
-      </w:r>
-      <w:r>
-        <w:t xml:space="preserve"> </w:t>
-      </w:r>
-      <w:r>
-        <w:t xml:space="preserve">The model, pricing and client advice below is the part that rots:</w:t>
-      </w:r>
-      <w:r>
-        <w:t xml:space="preserve"> </w:t>
-      </w:r>
-      <w:r>
-        <w:t xml:space="preserve">check anything about plans, limits or model names against Anthropic's current documentation before</w:t>
-      </w:r>
-      <w:r>
-        <w:t xml:space="preserve"> </w:t>
-      </w:r>
-      <w:r>
-        <w:t xml:space="preserve">relying on it.</w:t>
-      </w:r>
-    </w:p>
-    <w:bookmarkEnd w:id="13"/>
-    <w:bookmarkStart w:id="14" w:name="korus-for-multi-session-ai-coding"/>
+        <w:t xml:space="preserve">explains the session roles and how to use them each day.</w:t>
+      </w:r>
+    </w:p>
+    <w:p>
+      <w:pPr>
+        <w:pStyle w:val="BodyText"/>
+      </w:pPr>
+      <w:r>
+        <w:t xml:space="preserve">This account's model and pricing advice was last reviewed on 2026-08-16. The recommendations came</w:t>
+      </w:r>
+      <w:r>
+        <w:t xml:space="preserve"> </w:t>
+      </w:r>
+      <w:r>
+        <w:t xml:space="preserve">from tools used as of 8/12/2026; they are historical observations, not a fresh review of available plans.</w:t>
+      </w:r>
+    </w:p>
+    <w:p>
+      <w:pPr>
+        <w:pStyle w:val="BodyText"/>
+      </w:pPr>
+      <w:r>
+        <w:t xml:space="preserve">Check current Anthropic documentation before choosing models, buying accounts, or relying on</w:t>
+      </w:r>
+      <w:r>
+        <w:t xml:space="preserve"> </w:t>
+      </w:r>
+      <w:r>
+        <w:t xml:space="preserve">client behavior. Later sections also retain dated changes to the roles.</w:t>
+      </w:r>
+    </w:p>
+    <w:bookmarkEnd w:id="14"/>
+    <w:bookmarkStart w:id="15" w:name="korus-for-multi-session-ai-coding"/>
     <w:p>
       <w:pPr>
         <w:pStyle w:val="Heading2"/>
@@ -241,159 +220,79 @@
         <w:pStyle w:val="FirstParagraph"/>
       </w:pPr>
       <w:r>
-        <w:t xml:space="preserve">Here is the shape of what I've learned.</w:t>
-      </w:r>
-    </w:p>
-    <w:p>
-      <w:pPr>
+        <w:t xml:space="preserve">My setup combined these choices:</w:t>
+      </w:r>
+    </w:p>
+    <w:p>
+      <w:pPr>
+        <w:pStyle w:val="Compact"/>
         <w:numPr>
           <w:ilvl w:val="0"/>
           <w:numId w:val="1001"/>
         </w:numPr>
       </w:pPr>
       <w:r>
-        <w:t xml:space="preserve">Use Claude Code with Ultracode mode.</w:t>
-      </w:r>
-    </w:p>
-    <w:p>
-      <w:pPr>
+        <w:t xml:space="preserve">Claude Code with Ultracode mode.</w:t>
+      </w:r>
+    </w:p>
+    <w:p>
+      <w:pPr>
+        <w:pStyle w:val="Compact"/>
         <w:numPr>
           <w:ilvl w:val="0"/>
           <w:numId w:val="1001"/>
         </w:numPr>
       </w:pPr>
       <w:r>
-        <w:t xml:space="preserve">For multisession coding, Claude Code for Desktop works better than the VS Code extension.</w:t>
-      </w:r>
-    </w:p>
-    <w:p>
-      <w:pPr>
+        <w:t xml:space="preserve">Claude Code for Desktop for work across sessions, with VS Code available for reading and editing code.</w:t>
+      </w:r>
+    </w:p>
+    <w:p>
+      <w:pPr>
+        <w:pStyle w:val="Compact"/>
         <w:numPr>
           <w:ilvl w:val="0"/>
           <w:numId w:val="1001"/>
         </w:numPr>
       </w:pPr>
       <w:r>
-        <w:t xml:space="preserve">Use one or more Claude Max 20x accounts instead of Teams or Enterprise pricing.</w:t>
-      </w:r>
-    </w:p>
-    <w:p>
-      <w:pPr>
+        <w:t xml:space="preserve">One or more Claude Max 20x accounts, chosen for their compute cost rather than enterprise management features.</w:t>
+      </w:r>
+    </w:p>
+    <w:p>
+      <w:pPr>
+        <w:pStyle w:val="Compact"/>
         <w:numPr>
           <w:ilvl w:val="0"/>
           <w:numId w:val="1001"/>
         </w:numPr>
       </w:pPr>
       <w:r>
-        <w:t xml:space="preserve">Set up the sessions:</w:t>
-      </w:r>
-    </w:p>
-    <w:p>
-      <w:pPr>
-        <w:numPr>
-          <w:ilvl w:val="0"/>
-          <w:numId w:val="1000"/>
-        </w:numPr>
-      </w:pPr>
-      <w:r>
-        <w:rPr>
-          <w:b/>
-          <w:bCs/>
-        </w:rPr>
-        <w:t xml:space="preserve">4.1.</w:t>
-      </w:r>
-      <w:r>
-        <w:t xml:space="preserve"> </w:t>
-      </w:r>
-      <w:r>
-        <w:t xml:space="preserve">A console, the one session you talk to. It reads the record, picks an item, writes a</w:t>
-      </w:r>
-      <w:r>
-        <w:t xml:space="preserve"> </w:t>
-      </w:r>
-      <w:r>
-        <w:t xml:space="preserve">short brief, and starts a builder for it.</w:t>
-      </w:r>
-    </w:p>
-    <w:p>
-      <w:pPr>
-        <w:numPr>
-          <w:ilvl w:val="0"/>
-          <w:numId w:val="1000"/>
-        </w:numPr>
-      </w:pPr>
-      <w:r>
-        <w:rPr>
-          <w:b/>
-          <w:bCs/>
-        </w:rPr>
-        <w:t xml:space="preserve">4.2.</w:t>
-      </w:r>
-      <w:r>
-        <w:t xml:space="preserve"> </w:t>
-      </w:r>
-      <w:r>
-        <w:t xml:space="preserve">A builder for each brief. It makes the change, commits, pushes, and opens the pull</w:t>
-      </w:r>
-      <w:r>
-        <w:t xml:space="preserve"> </w:t>
-      </w:r>
-      <w:r>
-        <w:t xml:space="preserve">request, then its process exits.</w:t>
-      </w:r>
-    </w:p>
-    <w:p>
-      <w:pPr>
-        <w:numPr>
-          <w:ilvl w:val="0"/>
-          <w:numId w:val="1000"/>
-        </w:numPr>
-      </w:pPr>
-      <w:r>
-        <w:rPr>
-          <w:b/>
-          <w:bCs/>
-        </w:rPr>
-        <w:t xml:space="preserve">4.3.</w:t>
-      </w:r>
-      <w:r>
-        <w:t xml:space="preserve"> </w:t>
-      </w:r>
-      <w:r>
-        <w:t xml:space="preserve">A lander session, which decides what enters the merge queue and in what order.</w:t>
-      </w:r>
-    </w:p>
-    <w:p>
-      <w:pPr>
-        <w:numPr>
-          <w:ilvl w:val="0"/>
-          <w:numId w:val="1000"/>
-        </w:numPr>
-      </w:pPr>
-      <w:r>
-        <w:t xml:space="preserve">There are additional, optional sessions as described below.</w:t>
-      </w:r>
-    </w:p>
-    <w:p>
-      <w:pPr>
+        <w:t xml:space="preserve">A console to write briefs, a builder per brief, and a lander to manage the merge queue.</w:t>
+      </w:r>
+    </w:p>
+    <w:p>
+      <w:pPr>
+        <w:pStyle w:val="Compact"/>
         <w:numPr>
           <w:ilvl w:val="0"/>
           <w:numId w:val="1001"/>
         </w:numPr>
       </w:pPr>
       <w:r>
-        <w:t xml:space="preserve">Use worktrees with hooks enforcing Claude Code's behavior.</w:t>
-      </w:r>
-    </w:p>
-    <w:p>
-      <w:pPr>
+        <w:t xml:space="preserve">Worktrees and hooks to enforce the rules that prompts alone did not hold.</w:t>
+      </w:r>
+    </w:p>
+    <w:p>
+      <w:pPr>
+        <w:pStyle w:val="Compact"/>
         <w:numPr>
           <w:ilvl w:val="0"/>
           <w:numId w:val="1001"/>
         </w:numPr>
       </w:pPr>
       <w:r>
-        <w:t xml:space="preserve">Use the Kynet method to enable inter-session communication (see below).</w:t>
+        <w:t xml:space="preserve">The Kynet method for communication between sessions, described in section 8.</w:t>
       </w:r>
     </w:p>
     <w:p>
@@ -401,17 +300,17 @@
         <w:pStyle w:val="FirstParagraph"/>
       </w:pPr>
       <w:r>
-        <w:t xml:space="preserve">I'll go through each of those and more in the following sections. Note: these recommendations are</w:t>
-      </w:r>
-      <w:r>
-        <w:t xml:space="preserve"> </w:t>
-      </w:r>
-      <w:r>
-        <w:t xml:space="preserve">based on the Claude tools as of 8/12/2026. Things will change as Anthropic releases improvements.</w:t>
-      </w:r>
-    </w:p>
-    <w:bookmarkEnd w:id="14"/>
-    <w:bookmarkStart w:id="17" w:name="Xe4435a1d6436f1737b1b6caba610c8f95c0821f"/>
+        <w:t xml:space="preserve">The reviewer and regulator roles add checks around the builders' work. The sections below explain</w:t>
+      </w:r>
+      <w:r>
+        <w:t xml:space="preserve"> </w:t>
+      </w:r>
+      <w:r>
+        <w:t xml:space="preserve">the choices and their limits.</w:t>
+      </w:r>
+    </w:p>
+    <w:bookmarkEnd w:id="15"/>
+    <w:bookmarkStart w:id="18" w:name="Xe4435a1d6436f1737b1b6caba610c8f95c0821f"/>
     <w:p>
       <w:pPr>
         <w:pStyle w:val="Heading2"/>
@@ -424,7 +323,13 @@
       <w:pPr>
         <w:pStyle w:val="FirstParagraph"/>
       </w:pPr>
-      <w:hyperlink r:id="rId15">
+      <w:r>
+        <w:t xml:space="preserve">I found</w:t>
+      </w:r>
+      <w:r>
+        <w:t xml:space="preserve"> </w:t>
+      </w:r>
+      <w:hyperlink r:id="rId16">
         <w:r>
           <w:rPr>
             <w:rStyle w:val="Hyperlink"/>
@@ -436,18 +341,20 @@
         <w:t xml:space="preserve"> </w:t>
       </w:r>
       <w:r>
-        <w:t xml:space="preserve">produces better results. Enabling it empowers Claude to launch workflows, which are a key part of</w:t>
-      </w:r>
-      <w:r>
-        <w:t xml:space="preserve"> </w:t>
-      </w:r>
-      <w:r>
-        <w:t xml:space="preserve">this method. Workflows break the task into assignments handed to subagents. Ultracode also triggers</w:t>
-      </w:r>
-      <w:r>
-        <w:t xml:space="preserve"> </w:t>
-      </w:r>
-      <w:hyperlink r:id="rId16">
+        <w:t xml:space="preserve">useful because it lets Claude launch workflows. A workflow breaks a task into assignments for subagents.</w:t>
+      </w:r>
+    </w:p>
+    <w:p>
+      <w:pPr>
+        <w:pStyle w:val="BodyText"/>
+      </w:pPr>
+      <w:r>
+        <w:t xml:space="preserve">It also triggers</w:t>
+      </w:r>
+      <w:r>
+        <w:t xml:space="preserve"> </w:t>
+      </w:r>
+      <w:hyperlink r:id="rId17">
         <w:r>
           <w:rPr>
             <w:rStyle w:val="Hyperlink"/>
@@ -462,53 +369,53 @@
         <w:t xml:space="preserve"> </w:t>
       </w:r>
       <w:r>
-        <w:t xml:space="preserve">producing better results.</w:t>
-      </w:r>
-    </w:p>
-    <w:p>
-      <w:pPr>
-        <w:pStyle w:val="BodyText"/>
-      </w:pPr>
-      <w:r>
-        <w:t xml:space="preserve">Opus 5 is presently the best mode for creating strong code. It is even slightly better than Fable 5</w:t>
-      </w:r>
-      <w:r>
-        <w:t xml:space="preserve"> </w:t>
-      </w:r>
-      <w:r>
-        <w:t xml:space="preserve">at creating code and at half the price.</w:t>
-      </w:r>
-    </w:p>
-    <w:p>
-      <w:pPr>
-        <w:pStyle w:val="BodyText"/>
-      </w:pPr>
-      <w:r>
-        <w:t xml:space="preserve">Unfortunately, using Ultracode and Opus 5 together is slow. The result is worth the wait, having</w:t>
-      </w:r>
-      <w:r>
-        <w:t xml:space="preserve"> </w:t>
-      </w:r>
-      <w:r>
-        <w:t xml:space="preserve">fewer bugs to resolve later.</w:t>
-      </w:r>
-    </w:p>
-    <w:p>
-      <w:pPr>
-        <w:pStyle w:val="BodyText"/>
-      </w:pPr>
-      <w:r>
-        <w:t xml:space="preserve">That multisession method makes good use of the wait time. Since you are administering eight</w:t>
-      </w:r>
-      <w:r>
-        <w:t xml:space="preserve"> </w:t>
-      </w:r>
-      <w:r>
-        <w:t xml:space="preserve">workflows, there's usually something for you to decide.</w:t>
-      </w:r>
-    </w:p>
-    <w:bookmarkEnd w:id="17"/>
-    <w:bookmarkStart w:id="19" w:name="X8bb53164f71da1d081458c229f1305b01be35be"/>
+        <w:t xml:space="preserve">which helped catch mistakes in my work.</w:t>
+      </w:r>
+    </w:p>
+    <w:p>
+      <w:pPr>
+        <w:pStyle w:val="BodyText"/>
+      </w:pPr>
+      <w:r>
+        <w:t xml:space="preserve">At the time of this account, I preferred Opus 5 for code. In my experience it produced slightly</w:t>
+      </w:r>
+      <w:r>
+        <w:t xml:space="preserve"> </w:t>
+      </w:r>
+      <w:r>
+        <w:t xml:space="preserve">better code than Fable 5 at half the price.</w:t>
+      </w:r>
+    </w:p>
+    <w:p>
+      <w:pPr>
+        <w:pStyle w:val="BodyText"/>
+      </w:pPr>
+      <w:r>
+        <w:t xml:space="preserve">Ultracode with Opus 5 was slow, but I spent less time fixing bugs afterward. Running several</w:t>
+      </w:r>
+      <w:r>
+        <w:t xml:space="preserve"> </w:t>
+      </w:r>
+      <w:r>
+        <w:t xml:space="preserve">sessions gave me other work to review during those waits.</w:t>
+      </w:r>
+    </w:p>
+    <w:p>
+      <w:pPr>
+        <w:pStyle w:val="BodyText"/>
+      </w:pPr>
+      <w:r>
+        <w:t xml:space="preserve">With eight workflows active, there was usually a decision waiting for me. That describes my</w:t>
+      </w:r>
+      <w:r>
+        <w:t xml:space="preserve"> </w:t>
+      </w:r>
+      <w:r>
+        <w:t xml:space="preserve">workload, not a measured speed advantage over one session.</w:t>
+      </w:r>
+    </w:p>
+    <w:bookmarkEnd w:id="18"/>
+    <w:bookmarkStart w:id="20" w:name="X8bb53164f71da1d081458c229f1305b01be35be"/>
     <w:p>
       <w:pPr>
         <w:pStyle w:val="Heading2"/>
@@ -522,60 +429,40 @@
         <w:pStyle w:val="FirstParagraph"/>
       </w:pPr>
       <w:r>
-        <w:t xml:space="preserve">Claude's desktop application is the best at empowering intersession communication. The VS Code</w:t>
-      </w:r>
-      <w:r>
-        <w:t xml:space="preserve"> </w:t>
-      </w:r>
-      <w:r>
-        <w:t xml:space="preserve">extension lacks the strongest implementation of these as of 8/2026. As a result, running multiple</w:t>
-      </w:r>
-      <w:r>
-        <w:t xml:space="preserve"> </w:t>
-      </w:r>
-      <w:r>
-        <w:t xml:space="preserve">sessions inside of VS Code generates code collisions.</w:t>
-      </w:r>
-    </w:p>
-    <w:p>
-      <w:pPr>
-        <w:pStyle w:val="BodyText"/>
-      </w:pPr>
-      <w:r>
-        <w:t xml:space="preserve">The desktop app, however, makes it difficult to see the final code. In VS Code, you always are a</w:t>
-      </w:r>
-      <w:r>
-        <w:t xml:space="preserve"> </w:t>
-      </w:r>
-      <w:r>
-        <w:t xml:space="preserve">click away from the current codebase.</w:t>
-      </w:r>
-    </w:p>
-    <w:p>
-      <w:pPr>
-        <w:pStyle w:val="BodyText"/>
-      </w:pPr>
-      <w:r>
-        <w:t xml:space="preserve">You might find it helpful to have a VS Code instance running alongside your Claude desktop app. Use</w:t>
-      </w:r>
-      <w:r>
-        <w:t xml:space="preserve"> </w:t>
-      </w:r>
-      <w:r>
-        <w:t xml:space="preserve">the desktop app to generate the code and the VS Code to review and make manual edits.</w:t>
-      </w:r>
-    </w:p>
-    <w:p>
-      <w:pPr>
-        <w:pStyle w:val="BodyText"/>
-      </w:pPr>
-      <w:r>
-        <w:t xml:space="preserve">If you run more than one Claude account, set them up first:</w:t>
-      </w:r>
-      <w:r>
-        <w:t xml:space="preserve"> </w:t>
-      </w:r>
-      <w:hyperlink r:id="rId18">
+        <w:t xml:space="preserve">In 8/2026, I found the desktop app better at communication between sessions than the VS Code</w:t>
+      </w:r>
+      <w:r>
+        <w:t xml:space="preserve"> </w:t>
+      </w:r>
+      <w:r>
+        <w:t xml:space="preserve">extension. Multiple sessions in the extension had caused code collisions.</w:t>
+      </w:r>
+    </w:p>
+    <w:p>
+      <w:pPr>
+        <w:pStyle w:val="BodyText"/>
+      </w:pPr>
+      <w:r>
+        <w:t xml:space="preserve">VS Code made it easier to inspect the code itself. I kept it open alongside the desktop app:</w:t>
+      </w:r>
+      <w:r>
+        <w:t xml:space="preserve"> </w:t>
+      </w:r>
+      <w:r>
+        <w:t xml:space="preserve">Claude generated changes in the desktop app, and I reviewed or edited them in VS Code.</w:t>
+      </w:r>
+    </w:p>
+    <w:p>
+      <w:pPr>
+        <w:pStyle w:val="BodyText"/>
+      </w:pPr>
+      <w:r>
+        <w:t xml:space="preserve">If you use several Claude accounts,</w:t>
+      </w:r>
+      <w:r>
+        <w:t xml:space="preserve"> </w:t>
+      </w:r>
+      <w:hyperlink r:id="rId19">
         <w:r>
           <w:rPr>
             <w:rStyle w:val="Hyperlink"/>
@@ -587,17 +474,17 @@
         <w:t xml:space="preserve"> </w:t>
       </w:r>
       <w:r>
-        <w:t xml:space="preserve">covers one desktop instance per account, and the config root</w:t>
-      </w:r>
-      <w:r>
-        <w:t xml:space="preserve"> </w:t>
-      </w:r>
-      <w:r>
-        <w:t xml:space="preserve">each one adds.</w:t>
-      </w:r>
-    </w:p>
-    <w:bookmarkEnd w:id="19"/>
-    <w:bookmarkStart w:id="24" w:name="Xbf516e5646b002c3242b38238c46d10caad39f1"/>
+        <w:t xml:space="preserve">explains how to set up</w:t>
+      </w:r>
+      <w:r>
+        <w:t xml:space="preserve"> </w:t>
+      </w:r>
+      <w:r>
+        <w:t xml:space="preserve">one desktop instance per account and the config root each instance adds.</w:t>
+      </w:r>
+    </w:p>
+    <w:bookmarkEnd w:id="20"/>
+    <w:bookmarkStart w:id="25" w:name="Xbf516e5646b002c3242b38238c46d10caad39f1"/>
     <w:p>
       <w:pPr>
         <w:pStyle w:val="Heading2"/>
@@ -611,134 +498,93 @@
         <w:pStyle w:val="FirstParagraph"/>
       </w:pPr>
       <w:r>
-        <w:t xml:space="preserve">Yes, that header is correct: Claude's Max 20x accounts offer AI compute at 60x cheaper than the</w:t>
-      </w:r>
-      <w:r>
-        <w:t xml:space="preserve"> </w:t>
-      </w:r>
-      <w:r>
-        <w:t xml:space="preserve">undiscounted API rates you pay under Teams or Enterprise plans.</w:t>
-      </w:r>
-      <w:r>
-        <w:t xml:space="preserve"> </w:t>
-      </w:r>
-      <w:r>
-        <w:rPr>
-          <w:b/>
-          <w:bCs/>
-        </w:rPr>
-        <w:t xml:space="preserve">If you bought the same compute Max</w:t>
-      </w:r>
-      <w:r>
-        <w:rPr>
-          <w:b/>
-          <w:bCs/>
-        </w:rPr>
-        <w:t xml:space="preserve"> </w:t>
-      </w:r>
-      <w:r>
-        <w:rPr>
-          <w:b/>
-          <w:bCs/>
-        </w:rPr>
-        <w:t xml:space="preserve">20x gives you under API pricing, it would cost about $12,000.</w:t>
-      </w:r>
-      <w:r>
-        <w:t xml:space="preserve"> </w:t>
-      </w:r>
-      <w:r>
-        <w:t xml:space="preserve">For details, see</w:t>
-      </w:r>
-      <w:r>
-        <w:t xml:space="preserve"> </w:t>
-      </w:r>
-      <w:hyperlink r:id="rId20">
-        <w:r>
-          <w:rPr>
-            <w:rStyle w:val="Hyperlink"/>
-          </w:rPr>
-          <w:t xml:space="preserve">Token Accounting</w:t>
-        </w:r>
-      </w:hyperlink>
-      <w:r>
-        <w:t xml:space="preserve">.</w:t>
-      </w:r>
-    </w:p>
-    <w:p>
-      <w:pPr>
-        <w:pStyle w:val="BodyText"/>
-      </w:pPr>
-      <w:r>
-        <w:t xml:space="preserve">As a result, the Max 20x plan is the best way to affordably create your application. The individual</w:t>
-      </w:r>
-      <w:r>
-        <w:t xml:space="preserve"> </w:t>
-      </w:r>
-      <w:r>
-        <w:t xml:space="preserve">accounts lack the enterprise management features but can save you thousands.</w:t>
-      </w:r>
-    </w:p>
-    <w:p>
-      <w:pPr>
-        <w:pStyle w:val="BodyText"/>
-      </w:pPr>
-      <w:r>
-        <w:t xml:space="preserve">You may require multiple Max 20x accounts to cover a week of heavy development. You can sign up for</w:t>
-      </w:r>
-      <w:r>
-        <w:t xml:space="preserve"> </w:t>
-      </w:r>
-      <w:r>
-        <w:t xml:space="preserve">as many $200 per month accounts as you want, just use different email addresses.</w:t>
-      </w:r>
-    </w:p>
-    <w:p>
-      <w:pPr>
-        <w:pStyle w:val="BodyText"/>
-      </w:pPr>
-      <w:r>
-        <w:rPr>
-          <w:b/>
-          <w:bCs/>
-        </w:rPr>
-        <w:t xml:space="preserve">Check this against the current terms yourself before you rely on it.</w:t>
-      </w:r>
-      <w:r>
-        <w:t xml:space="preserve"> </w:t>
-      </w:r>
-      <w:r>
-        <w:t xml:space="preserve">I believe separate accounts</w:t>
-      </w:r>
-      <w:r>
-        <w:t xml:space="preserve"> </w:t>
-      </w:r>
-      <w:r>
-        <w:t xml:space="preserve">on separate email addresses are within the terms, and that belief is mine rather than a citation: I</w:t>
-      </w:r>
-      <w:r>
-        <w:t xml:space="preserve"> </w:t>
-      </w:r>
-      <w:r>
-        <w:t xml:space="preserve">am not a lawyer, and these documents change. The ones that govern it are Anthropic's</w:t>
-      </w:r>
-      <w:r>
-        <w:t xml:space="preserve"> </w:t>
-      </w:r>
+        <w:t xml:space="preserve">The original account valued a Max 20x plan's compute at about $12,000 at undiscounted API rates,</w:t>
+      </w:r>
+      <w:r>
+        <w:t xml:space="preserve"> </w:t>
+      </w:r>
+      <w:r>
+        <w:t xml:space="preserve">compared with a $200 monthly subscription. That is the basis for the reported 60x comparison.</w:t>
+      </w:r>
+    </w:p>
+    <w:p>
+      <w:pPr>
+        <w:pStyle w:val="BodyText"/>
+      </w:pPr>
       <w:hyperlink r:id="rId21">
         <w:r>
           <w:rPr>
             <w:rStyle w:val="Hyperlink"/>
           </w:rPr>
-          <w:t xml:space="preserve">Usage Policy</w:t>
+          <w:t xml:space="preserve">Token accounting</w:t>
         </w:r>
       </w:hyperlink>
       <w:r>
+        <w:t xml:space="preserve"> </w:t>
+      </w:r>
+      <w:r>
+        <w:t xml:space="preserve">explains the calculation and its limits. The comparison</w:t>
+      </w:r>
+      <w:r>
+        <w:t xml:space="preserve"> </w:t>
+      </w:r>
+      <w:r>
+        <w:t xml:space="preserve">used the undiscounted API rates associated with Teams or Enterprise pricing in that account.</w:t>
+      </w:r>
+    </w:p>
+    <w:p>
+      <w:pPr>
+        <w:pStyle w:val="BodyText"/>
+      </w:pPr>
+      <w:r>
+        <w:t xml:space="preserve">Individual accounts lack enterprise management features. In my workload, their lower compute cost</w:t>
+      </w:r>
+      <w:r>
+        <w:t xml:space="preserve"> </w:t>
+      </w:r>
+      <w:r>
+        <w:t xml:space="preserve">could save thousands, and more than one account could cover a week of heavy development.</w:t>
+      </w:r>
+    </w:p>
+    <w:p>
+      <w:pPr>
+        <w:pStyle w:val="BodyText"/>
+      </w:pPr>
+      <w:r>
+        <w:t xml:space="preserve">I believed separate accounts with separate email addresses were allowed, with no stated account</w:t>
+      </w:r>
+      <w:r>
+        <w:t xml:space="preserve"> </w:t>
+      </w:r>
+      <w:r>
+        <w:t xml:space="preserve">count limit. That was my reading, not legal advice or a cited permission; I am not a lawyer.</w:t>
+      </w:r>
+    </w:p>
+    <w:p>
+      <w:pPr>
+        <w:pStyle w:val="BodyText"/>
+      </w:pPr>
+      <w:r>
+        <w:t xml:space="preserve">Check</w:t>
+      </w:r>
+      <w:r>
+        <w:t xml:space="preserve"> </w:t>
+      </w:r>
+      <w:hyperlink r:id="rId22">
+        <w:r>
+          <w:rPr>
+            <w:rStyle w:val="Hyperlink"/>
+          </w:rPr>
+          <w:t xml:space="preserve">Anthropic's Usage Policy</w:t>
+        </w:r>
+      </w:hyperlink>
+      <w:r>
         <w:t xml:space="preserve">,</w:t>
       </w:r>
       <w:r>
         <w:t xml:space="preserve"> </w:t>
       </w:r>
-      <w:hyperlink r:id="rId22">
+      <w:hyperlink r:id="rId23">
         <w:r>
           <w:rPr>
             <w:rStyle w:val="Hyperlink"/>
@@ -752,88 +598,85 @@
       <w:r>
         <w:t xml:space="preserve"> </w:t>
       </w:r>
-      <w:hyperlink r:id="rId23">
+      <w:hyperlink r:id="rId24">
         <w:r>
           <w:rPr>
             <w:rStyle w:val="Hyperlink"/>
           </w:rPr>
-          <w:t xml:space="preserve">the Claude Code plan guidance</w:t>
+          <w:t xml:space="preserve">Claude Code plan guidance</w:t>
         </w:r>
       </w:hyperlink>
       <w:r>
-        <w:t xml:space="preserve">.</w:t>
-      </w:r>
-      <w:r>
-        <w:t xml:space="preserve"> </w:t>
-      </w:r>
-      <w:r>
-        <w:t xml:space="preserve">What is definitely not allowed is sharing one account between people.</w:t>
-      </w:r>
-    </w:p>
-    <w:p>
-      <w:pPr>
-        <w:pStyle w:val="BodyText"/>
-      </w:pPr>
-      <w:r>
-        <w:t xml:space="preserve">Max 20x limits your usage through five-hour session and weekly usage caps. Generally, 1% of weekly</w:t>
-      </w:r>
-      <w:r>
-        <w:t xml:space="preserve"> </w:t>
-      </w:r>
-      <w:r>
-        <w:t xml:space="preserve">usage equals about 5% of session usage.</w:t>
-      </w:r>
-    </w:p>
-    <w:p>
-      <w:pPr>
-        <w:pStyle w:val="BodyText"/>
-      </w:pPr>
-      <w:r>
-        <w:t xml:space="preserve">The per-session usage limits are a key factor in my recommendations. If you keep about eight build</w:t>
-      </w:r>
-      <w:r>
-        <w:t xml:space="preserve"> </w:t>
-      </w:r>
-      <w:r>
-        <w:t xml:space="preserve">tasks running at a time, you'll normally run under the session limits. You'll use up your weekly</w:t>
-      </w:r>
-      <w:r>
-        <w:t xml:space="preserve"> </w:t>
-      </w:r>
-      <w:r>
-        <w:t xml:space="preserve">limit in about two days.</w:t>
-      </w:r>
-    </w:p>
-    <w:p>
-      <w:pPr>
-        <w:pStyle w:val="BodyText"/>
-      </w:pPr>
-      <w:r>
-        <w:t xml:space="preserve">Splitting those tasks into separate sessions costs some intersession communication. It costs</w:t>
-      </w:r>
-      <w:r>
-        <w:t xml:space="preserve"> </w:t>
-      </w:r>
-      <w:r>
-        <w:t xml:space="preserve">nothing to leave a session idle once it has ended its turn.</w:t>
-      </w:r>
-    </w:p>
-    <w:p>
-      <w:pPr>
-        <w:pStyle w:val="BodyText"/>
-      </w:pPr>
-      <w:r>
-        <w:t xml:space="preserve">If you run tasks that fan out into many-agent workflows, especially /deep-research work, you'll</w:t>
-      </w:r>
-      <w:r>
-        <w:t xml:space="preserve"> </w:t>
-      </w:r>
-      <w:r>
-        <w:t xml:space="preserve">need to reduce the number of tasks running.</w:t>
-      </w:r>
-    </w:p>
-    <w:bookmarkEnd w:id="24"/>
-    <w:bookmarkStart w:id="25" w:name="X48031ae3eb3229342e6c438e9ce63589a721148"/>
+        <w:t xml:space="preserve"> </w:t>
+      </w:r>
+      <w:r>
+        <w:t xml:space="preserve">before relying on it.</w:t>
+      </w:r>
+    </w:p>
+    <w:p>
+      <w:pPr>
+        <w:pStyle w:val="BodyText"/>
+      </w:pPr>
+      <w:r>
+        <w:t xml:space="preserve">The original guidance prohibited sharing one account between people.</w:t>
+      </w:r>
+    </w:p>
+    <w:p>
+      <w:pPr>
+        <w:pStyle w:val="BodyText"/>
+      </w:pPr>
+      <w:r>
+        <w:t xml:space="preserve">Max 20x applied both five-hour session caps and weekly caps. In my observations, 1% of weekly</w:t>
+      </w:r>
+      <w:r>
+        <w:t xml:space="preserve"> </w:t>
+      </w:r>
+      <w:r>
+        <w:t xml:space="preserve">usage was roughly 5% of session usage.</w:t>
+      </w:r>
+    </w:p>
+    <w:p>
+      <w:pPr>
+        <w:pStyle w:val="BodyText"/>
+      </w:pPr>
+      <w:r>
+        <w:t xml:space="preserve">About eight build tasks at a time usually stayed under my session limit. That workload used the</w:t>
+      </w:r>
+      <w:r>
+        <w:t xml:space="preserve"> </w:t>
+      </w:r>
+      <w:r>
+        <w:t xml:space="preserve">weekly allowance in about two days.</w:t>
+      </w:r>
+    </w:p>
+    <w:p>
+      <w:pPr>
+        <w:pStyle w:val="BodyText"/>
+      </w:pPr>
+      <w:r>
+        <w:t xml:space="preserve">Separate sessions require some communication, but an idle session consumes no further compute</w:t>
+      </w:r>
+      <w:r>
+        <w:t xml:space="preserve"> </w:t>
+      </w:r>
+      <w:r>
+        <w:t xml:space="preserve">after its turn ends. Tasks that launch many agents, especially</w:t>
+      </w:r>
+      <w:r>
+        <w:t xml:space="preserve"> </w:t>
+      </w:r>
+      <w:r>
+        <w:rPr>
+          <w:rStyle w:val="VerbatimChar"/>
+        </w:rPr>
+        <w:t xml:space="preserve">/deep-research</w:t>
+      </w:r>
+      <w:r>
+        <w:t xml:space="preserve">, require fewer concurrent tasks.</w:t>
+      </w:r>
+    </w:p>
+    <w:bookmarkEnd w:id="25"/>
+    <w:bookmarkStart w:id="26" w:name="X48031ae3eb3229342e6c438e9ce63589a721148"/>
     <w:p>
       <w:pPr>
         <w:pStyle w:val="Heading2"/>
@@ -847,17 +690,17 @@
         <w:pStyle w:val="FirstParagraph"/>
       </w:pPr>
       <w:r>
-        <w:t xml:space="preserve">Have Claude Code create a project backlog. Then tell it to add things as they come up. Later, tell</w:t>
-      </w:r>
-      <w:r>
-        <w:t xml:space="preserve"> </w:t>
-      </w:r>
-      <w:r>
-        <w:t xml:space="preserve">the console session to create a plan for building down that backlog.</w:t>
-      </w:r>
-    </w:p>
-    <w:bookmarkEnd w:id="25"/>
-    <w:bookmarkStart w:id="30" w:name="X5ff9aeb0a54af642673c4763573e548d03ef2d1"/>
+        <w:t xml:space="preserve">Ask Claude Code to create a project backlog and add new work as it comes up. Have the console use</w:t>
+      </w:r>
+      <w:r>
+        <w:t xml:space="preserve"> </w:t>
+      </w:r>
+      <w:r>
+        <w:t xml:space="preserve">that backlog when it plans the next build tasks.</w:t>
+      </w:r>
+    </w:p>
+    <w:bookmarkEnd w:id="26"/>
+    <w:bookmarkStart w:id="31" w:name="X5ff9aeb0a54af642673c4763573e548d03ef2d1"/>
     <w:p>
       <w:pPr>
         <w:pStyle w:val="Heading2"/>
@@ -866,7 +709,7 @@
         <w:t xml:space="preserve">5. Documentation</w:t>
       </w:r>
     </w:p>
-    <w:bookmarkStart w:id="26" w:name="Xc4a89930dc259e99f9621cc0ce6d28e12a6abc5"/>
+    <w:bookmarkStart w:id="27" w:name="Xc4a89930dc259e99f9621cc0ce6d28e12a6abc5"/>
     <w:p>
       <w:pPr>
         <w:pStyle w:val="Heading3"/>
@@ -880,23 +723,31 @@
         <w:pStyle w:val="FirstParagraph"/>
       </w:pPr>
       <w:r>
-        <w:t xml:space="preserve">Have Claude create ADR documents for each significant build. When you ask the console session to</w:t>
-      </w:r>
-      <w:r>
-        <w:t xml:space="preserve"> </w:t>
-      </w:r>
-      <w:r>
-        <w:t xml:space="preserve">create a plan, just tell it to be sure to create ADRs as needed. This gives you a build record for</w:t>
-      </w:r>
-      <w:r>
-        <w:t xml:space="preserve"> </w:t>
-      </w:r>
-      <w:r>
-        <w:t xml:space="preserve">your CISO and any auditor. It also provides ongoing context for the AI.</w:t>
-      </w:r>
-    </w:p>
-    <w:bookmarkEnd w:id="26"/>
-    <w:bookmarkStart w:id="28" w:name="Xa3d08fb593ea8c8eb35229563c5295c44c50a37"/>
+        <w:t xml:space="preserve">Create architecture decision records (ADRs) for significant build decisions. Include that</w:t>
+      </w:r>
+      <w:r>
+        <w:t xml:space="preserve"> </w:t>
+      </w:r>
+      <w:r>
+        <w:t xml:space="preserve">requirement when you ask the console to make a plan.</w:t>
+      </w:r>
+    </w:p>
+    <w:p>
+      <w:pPr>
+        <w:pStyle w:val="BodyText"/>
+      </w:pPr>
+      <w:r>
+        <w:t xml:space="preserve">The records give the AI ongoing context. They also give your security lead and auditors a history</w:t>
+      </w:r>
+      <w:r>
+        <w:t xml:space="preserve"> </w:t>
+      </w:r>
+      <w:r>
+        <w:t xml:space="preserve">of the decisions behind the build.</w:t>
+      </w:r>
+    </w:p>
+    <w:bookmarkEnd w:id="27"/>
+    <w:bookmarkStart w:id="29" w:name="Xa3d08fb593ea8c8eb35229563c5295c44c50a37"/>
     <w:p>
       <w:pPr>
         <w:pStyle w:val="Heading3"/>
@@ -909,32 +760,37 @@
       <w:pPr>
         <w:pStyle w:val="FirstParagraph"/>
       </w:pPr>
-      <w:r>
-        <w:t xml:space="preserve">GitHub's Spec Kit is a strong starting point for SDD (Spec-Driven Development). It is an antidote to</w:t>
-      </w:r>
-      <w:r>
-        <w:t xml:space="preserve"> </w:t>
-      </w:r>
-      <w:r>
-        <w:t xml:space="preserve">vibe coding's flaws. See</w:t>
-      </w:r>
-      <w:r>
-        <w:t xml:space="preserve"> </w:t>
-      </w:r>
-      <w:hyperlink r:id="rId27">
+      <w:hyperlink r:id="rId28">
         <w:r>
           <w:rPr>
             <w:rStyle w:val="Hyperlink"/>
           </w:rPr>
-          <w:t xml:space="preserve">this Spec Kit page</w:t>
+          <w:t xml:space="preserve">GitHub Spec Kit</w:t>
         </w:r>
       </w:hyperlink>
       <w:r>
-        <w:t xml:space="preserve">.</w:t>
-      </w:r>
-    </w:p>
-    <w:bookmarkEnd w:id="28"/>
-    <w:bookmarkStart w:id="29" w:name="Xf099d6434e8bc2802e61e9fcd1379b29e44876b"/>
+        <w:t xml:space="preserve"> </w:t>
+      </w:r>
+      <w:r>
+        <w:t xml:space="preserve">helps structure spec-driven development: agree on what to</w:t>
+      </w:r>
+      <w:r>
+        <w:t xml:space="preserve"> </w:t>
+      </w:r>
+      <w:r>
+        <w:t xml:space="preserve">build, then use that specification to guide implementation.</w:t>
+      </w:r>
+    </w:p>
+    <w:p>
+      <w:pPr>
+        <w:pStyle w:val="BodyText"/>
+      </w:pPr>
+      <w:r>
+        <w:t xml:space="preserve">I use it to reduce the gaps left by open-ended coding prompts.</w:t>
+      </w:r>
+    </w:p>
+    <w:bookmarkEnd w:id="29"/>
+    <w:bookmarkStart w:id="30" w:name="Xf099d6434e8bc2802e61e9fcd1379b29e44876b"/>
     <w:p>
       <w:pPr>
         <w:pStyle w:val="Heading3"/>
@@ -948,58 +804,75 @@
         <w:pStyle w:val="FirstParagraph"/>
       </w:pPr>
       <w:r>
-        <w:t xml:space="preserve">OWASP's ASVS 5 framework is a great way to harden your application against hackers. There are three</w:t>
-      </w:r>
-      <w:r>
-        <w:t xml:space="preserve"> </w:t>
-      </w:r>
-      <w:r>
-        <w:t xml:space="preserve">security levels depending on what your application touches.</w:t>
-      </w:r>
-    </w:p>
-    <w:p>
-      <w:pPr>
-        <w:pStyle w:val="BodyText"/>
-      </w:pPr>
-      <w:r>
-        <w:t xml:space="preserve">Have Claude create a register of your ASVS scores. Be sure it works against the exact wording of</w:t>
-      </w:r>
-      <w:r>
-        <w:t xml:space="preserve"> </w:t>
-      </w:r>
-      <w:r>
-        <w:t xml:space="preserve">ASVS 5, not against summaries Claude creates or gets from other sources.</w:t>
-      </w:r>
-    </w:p>
-    <w:p>
-      <w:pPr>
-        <w:pStyle w:val="BodyText"/>
-      </w:pPr>
-      <w:r>
-        <w:t xml:space="preserve">Then, have Claude anchor your ASVS scores against sym/ctx anchors. Don't point at a line number in</w:t>
-      </w:r>
-      <w:r>
-        <w:t xml:space="preserve"> </w:t>
-      </w:r>
-      <w:r>
-        <w:t xml:space="preserve">the code; that changes when you update the code. Sym/ctx identifies code by its shape, not by its</w:t>
-      </w:r>
-      <w:r>
-        <w:t xml:space="preserve"> </w:t>
-      </w:r>
-      <w:r>
-        <w:t xml:space="preserve">position. That means the reference only changes when the actual code structure changes -- not when</w:t>
-      </w:r>
-      <w:r>
-        <w:t xml:space="preserve"> </w:t>
-      </w:r>
-      <w:r>
-        <w:t xml:space="preserve">someone adds whitespace, comments, or moves unrelated code above it.</w:t>
-      </w:r>
-    </w:p>
-    <w:bookmarkEnd w:id="29"/>
+        <w:t xml:space="preserve">The Open Worldwide Application Security Project's Application Security Verification Standard</w:t>
+      </w:r>
+      <w:r>
+        <w:t xml:space="preserve"> </w:t>
+      </w:r>
+      <w:r>
+        <w:t xml:space="preserve">(ASVS) 5 defines security requirements at three levels. Choose the level that fits what your application handles.</w:t>
+      </w:r>
+    </w:p>
+    <w:p>
+      <w:pPr>
+        <w:pStyle w:val="BodyText"/>
+      </w:pPr>
+      <w:r>
+        <w:t xml:space="preserve">Ask Claude to keep a register of ASVS scores against the exact ASVS 5 wording. Summaries from</w:t>
+      </w:r>
+      <w:r>
+        <w:t xml:space="preserve"> </w:t>
+      </w:r>
+      <w:r>
+        <w:t xml:space="preserve">Claude or another source can change what a requirement asks for.</w:t>
+      </w:r>
+    </w:p>
+    <w:p>
+      <w:pPr>
+        <w:pStyle w:val="BodyText"/>
+      </w:pPr>
+      <w:r>
+        <w:t xml:space="preserve">Use</w:t>
+      </w:r>
+      <w:r>
+        <w:t xml:space="preserve"> </w:t>
+      </w:r>
+      <w:r>
+        <w:rPr>
+          <w:rStyle w:val="VerbatimChar"/>
+        </w:rPr>
+        <w:t xml:space="preserve">sym/ctx</w:t>
+      </w:r>
+      <w:r>
+        <w:t xml:space="preserve"> </w:t>
+      </w:r>
+      <w:r>
+        <w:t xml:space="preserve">anchors to connect scores to code. They identify a symbol and its surrounding</w:t>
+      </w:r>
+      <w:r>
+        <w:t xml:space="preserve"> </w:t>
+      </w:r>
+      <w:r>
+        <w:t xml:space="preserve">structure, which is more stable than a line number.</w:t>
+      </w:r>
+    </w:p>
+    <w:p>
+      <w:pPr>
+        <w:pStyle w:val="BodyText"/>
+      </w:pPr>
+      <w:r>
+        <w:t xml:space="preserve">A line number shifts when someone adds whitespace, comments, or unrelated code above it. A</w:t>
+      </w:r>
+      <w:r>
+        <w:t xml:space="preserve"> </w:t>
+      </w:r>
+      <w:r>
+        <w:t xml:space="preserve">symbol-and-context reference changes when the code structure it identifies changes.</w:t>
+      </w:r>
+    </w:p>
     <w:bookmarkEnd w:id="30"/>
-    <w:bookmarkStart w:id="39" w:name="X1a76c22eabcca111b8576e9e9f91a92506a584c"/>
+    <w:bookmarkEnd w:id="31"/>
+    <w:bookmarkStart w:id="42" w:name="X1a76c22eabcca111b8576e9e9f91a92506a584c"/>
     <w:p>
       <w:pPr>
         <w:pStyle w:val="Heading2"/>
@@ -1013,14 +886,12 @@
         <w:pStyle w:val="FirstParagraph"/>
       </w:pPr>
       <w:r>
-        <w:t xml:space="preserve">Be sure Ultracode and Opus 5 are enabled for each session.</w:t>
-      </w:r>
-    </w:p>
-    <w:p>
-      <w:pPr>
-        <w:pStyle w:val="BodyText"/>
-      </w:pPr>
-      <w:hyperlink r:id="rId12">
+        <w:t xml:space="preserve">In the setup described here, each session used Ultracode and Opus 5.</w:t>
+      </w:r>
+      <w:r>
+        <w:t xml:space="preserve"> </w:t>
+      </w:r>
+      <w:hyperlink r:id="rId13">
         <w:r>
           <w:rPr>
             <w:rStyle w:val="Hyperlink"/>
@@ -1032,16 +903,10 @@
         <w:t xml:space="preserve"> </w:t>
       </w:r>
       <w:r>
-        <w:t xml:space="preserve">is the operating procedure for this section: the opening prompt</w:t>
-      </w:r>
-      <w:r>
-        <w:t xml:space="preserve"> </w:t>
-      </w:r>
-      <w:r>
-        <w:t xml:space="preserve">for each session, the daily loop, and what to do when it goes wrong.</w:t>
-      </w:r>
-    </w:p>
-    <w:bookmarkStart w:id="31" w:name="Xa94288f7ae704dec490945374c87f7abe482367"/>
+        <w:t xml:space="preserve">supplies the opening prompts, daily procedure, and recovery steps.</w:t>
+      </w:r>
+    </w:p>
+    <w:bookmarkStart w:id="32" w:name="Xa94288f7ae704dec490945374c87f7abe482367"/>
     <w:p>
       <w:pPr>
         <w:pStyle w:val="Heading3"/>
@@ -1055,29 +920,31 @@
         <w:pStyle w:val="FirstParagraph"/>
       </w:pPr>
       <w:r>
-        <w:t xml:space="preserve">The console is the only session you talk to. It reads the record, picks an item, writes a short</w:t>
-      </w:r>
-      <w:r>
-        <w:t xml:space="preserve"> </w:t>
-      </w:r>
-      <w:r>
-        <w:t xml:space="preserve">brief, and starts a builder for it. It then polls for state instead of waiting on a message. If a</w:t>
-      </w:r>
-      <w:r>
-        <w:t xml:space="preserve"> </w:t>
-      </w:r>
-      <w:r>
-        <w:t xml:space="preserve">builder hits a question its brief did not answer, the builder writes the question back to the</w:t>
-      </w:r>
-      <w:r>
-        <w:t xml:space="preserve"> </w:t>
-      </w:r>
-      <w:r>
-        <w:t xml:space="preserve">console and stops, and the console starts a fresh builder with a better brief.</w:t>
-      </w:r>
-    </w:p>
-    <w:bookmarkEnd w:id="31"/>
-    <w:bookmarkStart w:id="35" w:name="Xe3bf01049453ff15c210d2be20817c172d98756"/>
+        <w:t xml:space="preserve">The console is the session you talk to. It reads the project record, picks an item, writes a short</w:t>
+      </w:r>
+      <w:r>
+        <w:t xml:space="preserve"> </w:t>
+      </w:r>
+      <w:r>
+        <w:t xml:space="preserve">brief, and starts a builder.</w:t>
+      </w:r>
+    </w:p>
+    <w:p>
+      <w:pPr>
+        <w:pStyle w:val="BodyText"/>
+      </w:pPr>
+      <w:r>
+        <w:t xml:space="preserve">It polls for progress. If the brief leaves a question open, the builder writes that question back</w:t>
+      </w:r>
+      <w:r>
+        <w:t xml:space="preserve"> </w:t>
+      </w:r>
+      <w:r>
+        <w:t xml:space="preserve">and stops. The console then starts a fresh builder with a clearer brief.</w:t>
+      </w:r>
+    </w:p>
+    <w:bookmarkEnd w:id="32"/>
+    <w:bookmarkStart w:id="36" w:name="Xe3bf01049453ff15c210d2be20817c172d98756"/>
     <w:p>
       <w:pPr>
         <w:pStyle w:val="Heading3"/>
@@ -1091,32 +958,26 @@
         <w:pStyle w:val="FirstParagraph"/>
       </w:pPr>
       <w:r>
-        <w:t xml:space="preserve">A builder takes one brief and runs it to a pull request: the change, the commit, the push, and the</w:t>
-      </w:r>
-      <w:r>
-        <w:t xml:space="preserve"> </w:t>
-      </w:r>
-      <w:r>
-        <w:t xml:space="preserve">PR. Then its process exits. It never guesses at what the brief left open, and it never waits for an</w:t>
-      </w:r>
-      <w:r>
-        <w:t xml:space="preserve"> </w:t>
-      </w:r>
-      <w:r>
-        <w:t xml:space="preserve">answer.</w:t>
-      </w:r>
-    </w:p>
-    <w:p>
-      <w:pPr>
-        <w:pStyle w:val="BodyText"/>
-      </w:pPr>
-      <w:r>
-        <w:t xml:space="preserve">Note that Anthropic is working on</w:t>
-      </w:r>
-      <w:r>
-        <w:t xml:space="preserve"> </w:t>
-      </w:r>
-      <w:hyperlink r:id="rId32">
+        <w:t xml:space="preserve">A builder takes one brief through the change, commit, push, and pull request. Its process then</w:t>
+      </w:r>
+      <w:r>
+        <w:t xml:space="preserve"> </w:t>
+      </w:r>
+      <w:r>
+        <w:t xml:space="preserve">exits. It does not guess at missing requirements or wait for an answer.</w:t>
+      </w:r>
+    </w:p>
+    <w:p>
+      <w:pPr>
+        <w:pStyle w:val="BodyText"/>
+      </w:pPr>
+      <w:r>
+        <w:t xml:space="preserve">At the time of this account,</w:t>
+      </w:r>
+      <w:r>
+        <w:t xml:space="preserve"> </w:t>
+      </w:r>
+      <w:hyperlink r:id="rId33">
         <w:r>
           <w:rPr>
             <w:rStyle w:val="Hyperlink"/>
@@ -1125,18 +986,21 @@
         </w:r>
       </w:hyperlink>
       <w:r>
-        <w:t xml:space="preserve">,</w:t>
-      </w:r>
-      <w:r>
-        <w:t xml:space="preserve"> </w:t>
-      </w:r>
-      <w:r>
-        <w:t xml:space="preserve">which may be a significant enhancement once it is out of beta. For now, your builders will use</w:t>
-      </w:r>
-      <w:r>
-        <w:t xml:space="preserve"> </w:t>
-      </w:r>
-      <w:hyperlink r:id="rId33">
+        <w:t xml:space="preserve"> </w:t>
+      </w:r>
+      <w:r>
+        <w:t xml:space="preserve">was in beta.</w:t>
+      </w:r>
+      <w:r>
+        <w:t xml:space="preserve"> </w:t>
+      </w:r>
+      <w:r>
+        <w:t xml:space="preserve">The builders used</w:t>
+      </w:r>
+      <w:r>
+        <w:t xml:space="preserve"> </w:t>
+      </w:r>
+      <w:hyperlink r:id="rId34">
         <w:r>
           <w:rPr>
             <w:rStyle w:val="Hyperlink"/>
@@ -1145,25 +1009,31 @@
         </w:r>
       </w:hyperlink>
       <w:r>
-        <w:t xml:space="preserve">. See</w:t>
-      </w:r>
-      <w:r>
-        <w:t xml:space="preserve"> </w:t>
-      </w:r>
-      <w:hyperlink r:id="rId34">
+        <w:t xml:space="preserve">.</w:t>
+      </w:r>
+      <w:r>
+        <w:t xml:space="preserve"> </w:t>
+      </w:r>
+      <w:r>
+        <w:t xml:space="preserve">See also</w:t>
+      </w:r>
+      <w:r>
+        <w:t xml:space="preserve"> </w:t>
+      </w:r>
+      <w:hyperlink r:id="rId35">
         <w:r>
           <w:rPr>
             <w:rStyle w:val="Hyperlink"/>
           </w:rPr>
-          <w:t xml:space="preserve">Run agents in parallel - Claude Code Docs</w:t>
+          <w:t xml:space="preserve">Run agents in parallel</w:t>
         </w:r>
       </w:hyperlink>
       <w:r>
         <w:t xml:space="preserve">.</w:t>
       </w:r>
     </w:p>
-    <w:bookmarkEnd w:id="35"/>
-    <w:bookmarkStart w:id="36" w:name="X01dbd2a17b58d17af4e4408d9b17f20f3863f4f"/>
+    <w:bookmarkEnd w:id="36"/>
+    <w:bookmarkStart w:id="38" w:name="X01dbd2a17b58d17af4e4408d9b17f20f3863f4f"/>
     <w:p>
       <w:pPr>
         <w:pStyle w:val="Heading3"/>
@@ -1177,189 +1047,248 @@
         <w:pStyle w:val="FirstParagraph"/>
       </w:pPr>
       <w:r>
-        <w:t xml:space="preserve">Lander decides what enters the merge queue and in what order, and it merge-forwards. It should have</w:t>
-      </w:r>
-      <w:r>
-        <w:t xml:space="preserve"> </w:t>
-      </w:r>
-      <w:r>
-        <w:t xml:space="preserve">authority to handle these independently. This is needed because multisession coding creates merge</w:t>
-      </w:r>
-      <w:r>
-        <w:t xml:space="preserve"> </w:t>
-      </w:r>
-      <w:r>
-        <w:t xml:space="preserve">conflicts when the repo's head is constantly changing. This is especially true with larger</w:t>
-      </w:r>
-      <w:r>
-        <w:t xml:space="preserve"> </w:t>
-      </w:r>
-      <w:r>
-        <w:t xml:space="preserve">codebases, which created extended CI times. It will not merge a pull request that no reviewer has</w:t>
-      </w:r>
-      <w:r>
-        <w:t xml:space="preserve"> </w:t>
-      </w:r>
-      <w:r>
-        <w:t xml:space="preserve">labelled.</w:t>
-      </w:r>
-    </w:p>
-    <w:bookmarkEnd w:id="36"/>
-    <w:bookmarkStart w:id="37" w:name="X88dbc1b726c4228ef8af1f19f170eee122c831c"/>
-    <w:p>
-      <w:pPr>
-        <w:pStyle w:val="Heading3"/>
-      </w:pPr>
-      <w:r>
-        <w:t xml:space="preserve">6.4 Reviewer session</w:t>
-      </w:r>
-    </w:p>
-    <w:p>
-      <w:pPr>
-        <w:pStyle w:val="FirstParagraph"/>
-      </w:pPr>
-      <w:r>
-        <w:t xml:space="preserve">This section used to describe an ASVS monitor session, which was retired on 2026-09-01.</w:t>
-      </w:r>
-    </w:p>
-    <w:p>
-      <w:pPr>
-        <w:pStyle w:val="BodyText"/>
-      </w:pPr>
-      <w:r>
-        <w:t xml:space="preserve">Start a reviewer for each pull request. It reads the diff. On a pass it applies the reviewed label</w:t>
-      </w:r>
-      <w:r>
-        <w:t xml:space="preserve"> </w:t>
-      </w:r>
-      <w:r>
-        <w:t xml:space="preserve">and posts the head SHA it read, so you can tell which version was actually looked at. On a fail it</w:t>
-      </w:r>
-      <w:r>
-        <w:t xml:space="preserve"> </w:t>
-      </w:r>
-      <w:r>
-        <w:t xml:space="preserve">posts the findings on the pull request, for whichever builder comes next. A reviewer never merges.</w:t>
-      </w:r>
-    </w:p>
-    <w:bookmarkEnd w:id="37"/>
-    <w:bookmarkStart w:id="38" w:name="Xff877a136a022849bae3f06d835c670cea10db0"/>
-    <w:p>
-      <w:pPr>
-        <w:pStyle w:val="Heading3"/>
-      </w:pPr>
-      <w:r>
-        <w:t xml:space="preserve">6.5 Regulator session</w:t>
-      </w:r>
-    </w:p>
-    <w:p>
-      <w:pPr>
-        <w:pStyle w:val="FirstParagraph"/>
-      </w:pPr>
-      <w:r>
-        <w:t xml:space="preserve">Start a regulator when a required check goes red. Its job is deciding whose failure it is: the</w:t>
-      </w:r>
-      <w:r>
-        <w:t xml:space="preserve"> </w:t>
-      </w:r>
-      <w:r>
-        <w:t xml:space="preserve">pull request's, the trunk's, a flake's, or the queue's. Only the first is a builder's to fix.</w:t>
-      </w:r>
-      <w:r>
-        <w:t xml:space="preserve"> </w:t>
-      </w:r>
-      <w:r>
-        <w:t xml:space="preserve">Sending the other three back is the mistake it prevents. It has no memory of earlier reds, so</w:t>
-      </w:r>
-      <w:r>
-        <w:t xml:space="preserve"> </w:t>
-      </w:r>
-      <w:r>
-        <w:t xml:space="preserve">it keeps a log.</w:t>
-      </w:r>
-    </w:p>
-    <w:p>
-      <w:pPr>
-        <w:pStyle w:val="BodyText"/>
-      </w:pPr>
-      <w:r>
-        <w:rPr>
-          <w:b/>
-          <w:bCs/>
-        </w:rPr>
-        <w:t xml:space="preserve">A steward is not on this list, because it is not a session.</w:t>
-      </w:r>
-      <w:r>
-        <w:t xml:space="preserve"> </w:t>
-      </w:r>
-      <w:r>
-        <w:t xml:space="preserve">It is a cron with no model calls.</w:t>
-      </w:r>
-      <w:r>
-        <w:t xml:space="preserve"> </w:t>
-      </w:r>
-      <w:r>
-        <w:t xml:space="preserve">It reads account usage and names the account with headroom, and it cannot interrupt a session</w:t>
-      </w:r>
-      <w:r>
-        <w:t xml:space="preserve"> </w:t>
-      </w:r>
-      <w:r>
-        <w:t xml:space="preserve">that is already running.</w:t>
-      </w:r>
-    </w:p>
-    <w:bookmarkEnd w:id="38"/>
-    <w:bookmarkEnd w:id="39"/>
-    <w:bookmarkStart w:id="42" w:name="Xfc881a61c1b7e5edb382f7c2ee75f5a253033e1"/>
-    <w:p>
-      <w:pPr>
-        <w:pStyle w:val="Heading2"/>
-      </w:pPr>
-      <w:r>
-        <w:t xml:space="preserve">7. Worktrees</w:t>
-      </w:r>
-    </w:p>
-    <w:p>
-      <w:pPr>
-        <w:pStyle w:val="FirstParagraph"/>
-      </w:pPr>
-      <w:r>
-        <w:t xml:space="preserve">Worktrees deconflict workflows sharing a repo. See</w:t>
-      </w:r>
-      <w:r>
-        <w:t xml:space="preserve"> </w:t>
-      </w:r>
-      <w:hyperlink r:id="rId40">
+        <w:t xml:space="preserve">The lander chooses which changes enter the merge queue and in what order. With authority from the</w:t>
+      </w:r>
+      <w:r>
+        <w:t xml:space="preserve"> </w:t>
+      </w:r>
+      <w:r>
+        <w:t xml:space="preserve">owner, it also merges newer trunk changes into branches that need them.</w:t>
+      </w:r>
+    </w:p>
+    <w:p>
+      <w:pPr>
+        <w:pStyle w:val="BodyText"/>
+      </w:pPr>
+      <w:r>
+        <w:t xml:space="preserve">This matters when concurrent work keeps moving the repository's head, especially when large</w:t>
+      </w:r>
+      <w:r>
+        <w:t xml:space="preserve"> </w:t>
+      </w:r>
+      <w:r>
+        <w:t xml:space="preserve">codebases take longer to test.</w:t>
+      </w:r>
+    </w:p>
+    <w:p>
+      <w:pPr>
+        <w:pStyle w:val="BodyText"/>
+      </w:pPr>
+      <w:r>
+        <w:t xml:space="preserve">The original account required a reviewer label before merging. That rule was retired on</w:t>
+      </w:r>
+      <w:r>
+        <w:t xml:space="preserve"> </w:t>
+      </w:r>
+      <w:r>
+        <w:t xml:space="preserve">2026-09-04; use the current</w:t>
+      </w:r>
+      <w:r>
+        <w:t xml:space="preserve"> </w:t>
+      </w:r>
+      <w:hyperlink r:id="rId37">
         <w:r>
           <w:rPr>
             <w:rStyle w:val="Hyperlink"/>
           </w:rPr>
-          <w:t xml:space="preserve">Worktrees - claude-multisession</w:t>
+          <w:t xml:space="preserve">Lander card</w:t>
         </w:r>
       </w:hyperlink>
       <w:r>
         <w:t xml:space="preserve"> </w:t>
       </w:r>
       <w:r>
-        <w:t xml:space="preserve">and</w:t>
-      </w:r>
-      <w:r>
-        <w:t xml:space="preserve"> </w:t>
-      </w:r>
-      <w:hyperlink r:id="rId41">
+        <w:t xml:space="preserve">and repository checks for today's requirement.</w:t>
+      </w:r>
+    </w:p>
+    <w:bookmarkEnd w:id="38"/>
+    <w:bookmarkStart w:id="40" w:name="X88dbc1b726c4228ef8af1f19f170eee122c831c"/>
+    <w:p>
+      <w:pPr>
+        <w:pStyle w:val="Heading3"/>
+      </w:pPr>
+      <w:r>
+        <w:t xml:space="preserve">6.4 Reviewer session</w:t>
+      </w:r>
+    </w:p>
+    <w:p>
+      <w:pPr>
+        <w:pStyle w:val="FirstParagraph"/>
+      </w:pPr>
+      <w:r>
+        <w:t xml:space="preserve">This section once described an ASVS monitor, a role retired on 2026-09-01.</w:t>
+      </w:r>
+    </w:p>
+    <w:p>
+      <w:pPr>
+        <w:pStyle w:val="BodyText"/>
+      </w:pPr>
+      <w:r>
+        <w:t xml:space="preserve">Start a reviewer for each pull request. It reads the diff and records the exact head commit it</w:t>
+      </w:r>
+      <w:r>
+        <w:t xml:space="preserve"> </w:t>
+      </w:r>
+      <w:r>
+        <w:t xml:space="preserve">examined. Findings go on the pull request for the next builder; the reviewer never merges.</w:t>
+      </w:r>
+    </w:p>
+    <w:p>
+      <w:pPr>
+        <w:pStyle w:val="BodyText"/>
+      </w:pPr>
+      <w:r>
+        <w:t xml:space="preserve">The original procedure also applied a</w:t>
+      </w:r>
+      <w:r>
+        <w:t xml:space="preserve"> </w:t>
+      </w:r>
+      <w:r>
+        <w:rPr>
+          <w:rStyle w:val="VerbatimChar"/>
+        </w:rPr>
+        <w:t xml:space="preserve">reviewed</w:t>
+      </w:r>
+      <w:r>
+        <w:t xml:space="preserve"> </w:t>
+      </w:r>
+      <w:r>
+        <w:t xml:space="preserve">label on a pass. The label-based merge gate was</w:t>
+      </w:r>
+      <w:r>
+        <w:t xml:space="preserve"> </w:t>
+      </w:r>
+      <w:r>
+        <w:t xml:space="preserve">retired on 2026-09-04, as the current</w:t>
+      </w:r>
+      <w:r>
+        <w:t xml:space="preserve"> </w:t>
+      </w:r>
+      <w:hyperlink r:id="rId39">
         <w:r>
           <w:rPr>
             <w:rStyle w:val="Hyperlink"/>
           </w:rPr>
-          <w:t xml:space="preserve">Run parallel sessions with worktrees - Claude Code Docs</w:t>
+          <w:t xml:space="preserve">Reviewer card</w:t>
         </w:r>
       </w:hyperlink>
       <w:r>
+        <w:t xml:space="preserve"> </w:t>
+      </w:r>
+      <w:r>
+        <w:t xml:space="preserve">records.</w:t>
+      </w:r>
+    </w:p>
+    <w:bookmarkEnd w:id="40"/>
+    <w:bookmarkStart w:id="41" w:name="Xff877a136a022849bae3f06d835c670cea10db0"/>
+    <w:p>
+      <w:pPr>
+        <w:pStyle w:val="Heading3"/>
+      </w:pPr>
+      <w:r>
+        <w:t xml:space="preserve">6.5 Regulator session</w:t>
+      </w:r>
+    </w:p>
+    <w:p>
+      <w:pPr>
+        <w:pStyle w:val="FirstParagraph"/>
+      </w:pPr>
+      <w:r>
+        <w:t xml:space="preserve">Start a regulator when a required check fails. It determines whether the cause belongs to the</w:t>
+      </w:r>
+      <w:r>
+        <w:t xml:space="preserve"> </w:t>
+      </w:r>
+      <w:r>
+        <w:t xml:space="preserve">pull request, trunk, an intermittent test failure, or the queue.</w:t>
+      </w:r>
+    </w:p>
+    <w:p>
+      <w:pPr>
+        <w:pStyle w:val="BodyText"/>
+      </w:pPr>
+      <w:r>
+        <w:t xml:space="preserve">Only a failure caused by the pull request goes back to its builder. The regulator keeps a log</w:t>
+      </w:r>
+      <w:r>
+        <w:t xml:space="preserve"> </w:t>
+      </w:r>
+      <w:r>
+        <w:t xml:space="preserve">because it does not retain memory of earlier failed runs.</w:t>
+      </w:r>
+    </w:p>
+    <w:p>
+      <w:pPr>
+        <w:pStyle w:val="BodyText"/>
+      </w:pPr>
+      <w:r>
+        <w:t xml:space="preserve">The steward is a scheduled script, not an AI session. It reads account usage and identifies an</w:t>
+      </w:r>
+      <w:r>
+        <w:t xml:space="preserve"> </w:t>
+      </w:r>
+      <w:r>
+        <w:t xml:space="preserve">account with room left. It makes no model calls and cannot interrupt a running session.</w:t>
+      </w:r>
+    </w:p>
+    <w:bookmarkEnd w:id="41"/>
+    <w:bookmarkEnd w:id="42"/>
+    <w:bookmarkStart w:id="45" w:name="Xfc881a61c1b7e5edb382f7c2ee75f5a253033e1"/>
+    <w:p>
+      <w:pPr>
+        <w:pStyle w:val="Heading2"/>
+      </w:pPr>
+      <w:r>
+        <w:t xml:space="preserve">7. Worktrees</w:t>
+      </w:r>
+    </w:p>
+    <w:p>
+      <w:pPr>
+        <w:pStyle w:val="FirstParagraph"/>
+      </w:pPr>
+      <w:r>
+        <w:t xml:space="preserve">Give each session its own worktree so it can edit files without changing another session's</w:t>
+      </w:r>
+      <w:r>
+        <w:t xml:space="preserve"> </w:t>
+      </w:r>
+      <w:r>
+        <w:t xml:space="preserve">checkout. Read</w:t>
+      </w:r>
+      <w:r>
+        <w:t xml:space="preserve"> </w:t>
+      </w:r>
+      <w:hyperlink r:id="rId43">
+        <w:r>
+          <w:rPr>
+            <w:rStyle w:val="Hyperlink"/>
+          </w:rPr>
+          <w:t xml:space="preserve">Worktrees</w:t>
+        </w:r>
+      </w:hyperlink>
+      <w:r>
+        <w:t xml:space="preserve"> </w:t>
+      </w:r>
+      <w:r>
+        <w:t xml:space="preserve">and</w:t>
+      </w:r>
+      <w:r>
+        <w:t xml:space="preserve"> </w:t>
+      </w:r>
+      <w:hyperlink r:id="rId44">
+        <w:r>
+          <w:rPr>
+            <w:rStyle w:val="Hyperlink"/>
+          </w:rPr>
+          <w:t xml:space="preserve">Claude Code's worktree guide</w:t>
+        </w:r>
+      </w:hyperlink>
+      <w:r>
         <w:t xml:space="preserve">.</w:t>
       </w:r>
     </w:p>
-    <w:bookmarkEnd w:id="42"/>
-    <w:bookmarkStart w:id="45" w:name="X515c0360240f6cf4d0e8b129bb6b9d1475316e9"/>
+    <w:bookmarkEnd w:id="45"/>
+    <w:bookmarkStart w:id="48" w:name="X515c0360240f6cf4d0e8b129bb6b9d1475316e9"/>
     <w:p>
       <w:pPr>
         <w:pStyle w:val="Heading2"/>
@@ -1373,26 +1302,18 @@
         <w:pStyle w:val="FirstParagraph"/>
       </w:pPr>
       <w:r>
-        <w:t xml:space="preserve">Claude Code sessions can be configured to speak with each other. The method differs between sessions</w:t>
-      </w:r>
-      <w:r>
-        <w:t xml:space="preserve"> </w:t>
-      </w:r>
-      <w:r>
-        <w:t xml:space="preserve">inside of the desktop app and those in the VS Code extension.</w:t>
-      </w:r>
-    </w:p>
-    <w:p>
-      <w:pPr>
-        <w:pStyle w:val="BodyText"/>
-      </w:pPr>
-      <w:r>
-        <w:t xml:space="preserve">Combined with the coordination methods listed in</w:t>
-      </w:r>
-      <w:r>
-        <w:t xml:space="preserve"> </w:t>
-      </w:r>
-      <w:hyperlink r:id="rId43">
+        <w:t xml:space="preserve">Sessions can exchange messages, but the available channels differ between the desktop app and</w:t>
+      </w:r>
+      <w:r>
+        <w:t xml:space="preserve"> </w:t>
+      </w:r>
+      <w:r>
+        <w:t xml:space="preserve">the VS Code extension.</w:t>
+      </w:r>
+      <w:r>
+        <w:t xml:space="preserve"> </w:t>
+      </w:r>
+      <w:hyperlink r:id="rId46">
         <w:r>
           <w:rPr>
             <w:rStyle w:val="Hyperlink"/>
@@ -1401,34 +1322,42 @@
         </w:r>
       </w:hyperlink>
       <w:r>
-        <w:t xml:space="preserve">, the sessions can build your</w:t>
-      </w:r>
-      <w:r>
-        <w:t xml:space="preserve"> </w:t>
-      </w:r>
-      <w:r>
-        <w:t xml:space="preserve">project without conflict -- mostly. When there is a conflict, a builder writes the problem to the</w:t>
-      </w:r>
-      <w:r>
-        <w:t xml:space="preserve"> </w:t>
-      </w:r>
-      <w:r>
-        <w:t xml:space="preserve">console rather than guessing, and the console decides what happens next. Also see</w:t>
-      </w:r>
-      <w:r>
-        <w:t xml:space="preserve"> </w:t>
-      </w:r>
-      <w:hyperlink r:id="rId44">
+        <w:t xml:space="preserve"> </w:t>
+      </w:r>
+      <w:r>
+        <w:t xml:space="preserve">describes the checks around their shared work.</w:t>
+      </w:r>
+    </w:p>
+    <w:p>
+      <w:pPr>
+        <w:pStyle w:val="BodyText"/>
+      </w:pPr>
+      <w:r>
+        <w:t xml:space="preserve">Conflicts still happen. A builder reports an unresolved problem to the console, which decides</w:t>
+      </w:r>
+      <w:r>
+        <w:t xml:space="preserve"> </w:t>
+      </w:r>
+      <w:r>
+        <w:t xml:space="preserve">what to do next. See</w:t>
+      </w:r>
+      <w:r>
+        <w:t xml:space="preserve"> </w:t>
+      </w:r>
+      <w:hyperlink r:id="rId47">
         <w:r>
           <w:rPr>
             <w:rStyle w:val="Hyperlink"/>
           </w:rPr>
-          <w:t xml:space="preserve">Message your other Claude Code sessions - Claude Code Docs</w:t>
+          <w:t xml:space="preserve">Claude Code's cross-session messaging guide</w:t>
         </w:r>
       </w:hyperlink>
-    </w:p>
-    <w:bookmarkEnd w:id="45"/>
-    <w:bookmarkStart w:id="47" w:name="X59739ce650e297ae022c956a66a1ad695ac4192"/>
+      <w:r>
+        <w:t xml:space="preserve">.</w:t>
+      </w:r>
+    </w:p>
+    <w:bookmarkEnd w:id="48"/>
+    <w:bookmarkStart w:id="50" w:name="X59739ce650e297ae022c956a66a1ad695ac4192"/>
     <w:p>
       <w:pPr>
         <w:pStyle w:val="Heading2"/>
@@ -1442,28 +1371,31 @@
         <w:pStyle w:val="FirstParagraph"/>
       </w:pPr>
       <w:r>
-        <w:t xml:space="preserve">Anthropic has rejected enhancement requests asking to make Claude Code usage-limit aware. So, Claude</w:t>
-      </w:r>
-      <w:r>
-        <w:t xml:space="preserve"> </w:t>
-      </w:r>
-      <w:r>
-        <w:t xml:space="preserve">and I built one:</w:t>
-      </w:r>
-      <w:r>
-        <w:t xml:space="preserve"> </w:t>
-      </w:r>
-      <w:hyperlink r:id="rId46">
+        <w:t xml:space="preserve">After Anthropic rejected requests to make Claude Code aware of usage limits, I worked with Claude</w:t>
+      </w:r>
+      <w:r>
+        <w:t xml:space="preserve"> </w:t>
+      </w:r>
+      <w:r>
+        <w:t xml:space="preserve">on</w:t>
+      </w:r>
+      <w:r>
+        <w:t xml:space="preserve"> </w:t>
+      </w:r>
+      <w:hyperlink r:id="rId49">
         <w:r>
           <w:rPr>
             <w:rStyle w:val="Hyperlink"/>
           </w:rPr>
-          <w:t xml:space="preserve">Usage awareness: knowing when to stop.</w:t>
+          <w:t xml:space="preserve">usage awareness</w:t>
         </w:r>
       </w:hyperlink>
-    </w:p>
-    <w:bookmarkEnd w:id="47"/>
-    <w:bookmarkStart w:id="49" w:name="X4e68ad135e57c05e0c49f806ccb0c45722a1de8"/>
+      <w:r>
+        <w:t xml:space="preserve">. That page describes the design and what it does and does not ship.</w:t>
+      </w:r>
+    </w:p>
+    <w:bookmarkEnd w:id="50"/>
+    <w:bookmarkStart w:id="52" w:name="X4e68ad135e57c05e0c49f806ccb0c45722a1de8"/>
     <w:p>
       <w:pPr>
         <w:pStyle w:val="Heading2"/>
@@ -1477,31 +1409,36 @@
         <w:pStyle w:val="FirstParagraph"/>
       </w:pPr>
       <w:r>
-        <w:t xml:space="preserve">CI using GitHub Actions automates enforcement of your quality standards and prevents bugs from</w:t>
-      </w:r>
-      <w:r>
-        <w:t xml:space="preserve"> </w:t>
-      </w:r>
-      <w:r>
-        <w:t xml:space="preserve">reaching the repo. See</w:t>
-      </w:r>
-      <w:r>
-        <w:t xml:space="preserve"> </w:t>
-      </w:r>
-      <w:hyperlink r:id="rId48">
+        <w:t xml:space="preserve">Continuous integration runs automated checks when code changes. With GitHub Actions and required</w:t>
+      </w:r>
+      <w:r>
+        <w:t xml:space="preserve"> </w:t>
+      </w:r>
+      <w:r>
+        <w:t xml:space="preserve">checks, you can block changes that fail your project's standards.</w:t>
+      </w:r>
+    </w:p>
+    <w:p>
+      <w:pPr>
+        <w:pStyle w:val="BodyText"/>
+      </w:pPr>
+      <w:hyperlink r:id="rId51">
         <w:r>
           <w:rPr>
             <w:rStyle w:val="Hyperlink"/>
           </w:rPr>
-          <w:t xml:space="preserve">this CI introduction</w:t>
+          <w:t xml:space="preserve">CI for leaders</w:t>
         </w:r>
       </w:hyperlink>
       <w:r>
-        <w:t xml:space="preserve">.</w:t>
-      </w:r>
-    </w:p>
-    <w:bookmarkEnd w:id="49"/>
-    <w:bookmarkEnd w:id="50"/>
+        <w:t xml:space="preserve"> </w:t>
+      </w:r>
+      <w:r>
+        <w:t xml:space="preserve">explains how to choose checks and what their results establish.</w:t>
+      </w:r>
+    </w:p>
+    <w:bookmarkEnd w:id="52"/>
+    <w:bookmarkEnd w:id="53"/>
     <w:sectPr>
       <w:footnotePr>
         <w:numRestart w:val="eachSect"/>
@@ -1612,123 +1549,114 @@
       </w:pPr>
     </w:lvl>
   </w:abstractNum>
-  <w:abstractNum w:abstractNumId="99411">
-    <w:nsid w:val="00A99411"/>
+  <w:abstractNum w:abstractNumId="991">
+    <w:nsid w:val="0000A991"/>
     <w:multiLevelType w:val="multilevel"/>
     <w:lvl w:ilvl="0">
-      <w:start w:val="1"/>
-      <w:numFmt w:val="decimal"/>
-      <w:lvlText w:val="%1."/>
+      <w:numFmt w:val="bullet"/>
+      <w:lvlText w:val=""/>
       <w:lvlJc w:val="left"/>
       <w:pPr>
         <w:ind w:left="720" w:hanging="360"/>
       </w:pPr>
+      <w:rPr>
+        <w:rFonts w:ascii="Symbol" w:hAnsi="Symbol" w:cs="Symbol" w:hint="default"/>
+      </w:rPr>
     </w:lvl>
     <w:lvl w:ilvl="1">
-      <w:start w:val="1"/>
-      <w:numFmt w:val="decimal"/>
-      <w:lvlText w:val="%2."/>
+      <w:numFmt w:val="bullet"/>
+      <w:lvlText w:val="o"/>
       <w:lvlJc w:val="left"/>
       <w:pPr>
         <w:ind w:left="1440" w:hanging="360"/>
       </w:pPr>
+      <w:rPr>
+        <w:rFonts w:ascii="Courier New" w:hAnsi="Courier New" w:cs="Courier New" w:hint="default"/>
+      </w:rPr>
     </w:lvl>
     <w:lvl w:ilvl="2">
-      <w:start w:val="1"/>
-      <w:numFmt w:val="decimal"/>
-      <w:lvlText w:val="%3."/>
+      <w:numFmt w:val="bullet"/>
+      <w:lvlText w:val=""/>
       <w:lvlJc w:val="left"/>
       <w:pPr>
         <w:ind w:left="2160" w:hanging="360"/>
       </w:pPr>
+      <w:rPr>
+        <w:rFonts w:ascii="Wingdings" w:hAnsi="Wingdings" w:cs="Wingdings" w:hint="default"/>
+      </w:rPr>
     </w:lvl>
     <w:lvl w:ilvl="3">
-      <w:start w:val="1"/>
-      <w:numFmt w:val="decimal"/>
-      <w:lvlText w:val="%4."/>
+      <w:numFmt w:val="bullet"/>
+      <w:lvlText w:val=""/>
       <w:lvlJc w:val="left"/>
       <w:pPr>
         <w:ind w:left="2880" w:hanging="360"/>
       </w:pPr>
+      <w:rPr>
+        <w:rFonts w:ascii="Symbol" w:hAnsi="Symbol" w:cs="Symbol" w:hint="default"/>
+      </w:rPr>
     </w:lvl>
     <w:lvl w:ilvl="4">
-      <w:start w:val="1"/>
-      <w:numFmt w:val="decimal"/>
-      <w:lvlText w:val="%5."/>
+      <w:numFmt w:val="bullet"/>
+      <w:lvlText w:val="o"/>
       <w:lvlJc w:val="left"/>
       <w:pPr>
         <w:ind w:left="3600" w:hanging="360"/>
       </w:pPr>
+      <w:rPr>
+        <w:rFonts w:ascii="Courier New" w:hAnsi="Courier New" w:cs="Courier New" w:hint="default"/>
+      </w:rPr>
     </w:lvl>
     <w:lvl w:ilvl="5">
-      <w:start w:val="1"/>
-      <w:numFmt w:val="decimal"/>
-      <w:lvlText w:val="%6."/>
+      <w:numFmt w:val="bullet"/>
+      <w:lvlText w:val=""/>
       <w:lvlJc w:val="left"/>
       <w:pPr>
         <w:ind w:left="4320" w:hanging="360"/>
       </w:pPr>
+      <w:rPr>
+        <w:rFonts w:ascii="Wingdings" w:hAnsi="Wingdings" w:cs="Wingdings" w:hint="default"/>
+      </w:rPr>
     </w:lvl>
     <w:lvl w:ilvl="6">
-      <w:start w:val="1"/>
-      <w:numFmt w:val="decimal"/>
-      <w:lvlText w:val="%7."/>
+      <w:numFmt w:val="bullet"/>
+      <w:lvlText w:val=""/>
       <w:lvlJc w:val="left"/>
       <w:pPr>
         <w:ind w:left="5040" w:hanging="360"/>
       </w:pPr>
+      <w:rPr>
+        <w:rFonts w:ascii="Symbol" w:hAnsi="Symbol" w:cs="Symbol" w:hint="default"/>
+      </w:rPr>
     </w:lvl>
     <w:lvl w:ilvl="7">
-      <w:start w:val="1"/>
-      <w:numFmt w:val="decimal"/>
-      <w:lvlText w:val="%8."/>
+      <w:numFmt w:val="bullet"/>
+      <w:lvlText w:val="o"/>
       <w:lvlJc w:val="left"/>
       <w:pPr>
         <w:ind w:left="5760" w:hanging="360"/>
       </w:pPr>
+      <w:rPr>
+        <w:rFonts w:ascii="Courier New" w:hAnsi="Courier New" w:cs="Courier New" w:hint="default"/>
+      </w:rPr>
     </w:lvl>
     <w:lvl w:ilvl="8">
-      <w:start w:val="1"/>
-      <w:numFmt w:val="decimal"/>
-      <w:lvlText w:val="%9."/>
+      <w:numFmt w:val="bullet"/>
+      <w:lvlText w:val=""/>
       <w:lvlJc w:val="left"/>
       <w:pPr>
         <w:ind w:left="6480" w:hanging="360"/>
       </w:pPr>
+      <w:rPr>
+        <w:rFonts w:ascii="Wingdings" w:hAnsi="Wingdings" w:cs="Wingdings" w:hint="default"/>
+      </w:rPr>
     </w:lvl>
   </w:abstractNum>
   <w:num w:numId="1000">
     <w:abstractNumId w:val="990"/>
   </w:num>
   <w:num w:numId="1001">
-    <w:abstractNumId w:val="99411"/>
-    <w:lvlOverride w:ilvl="0">
-      <w:startOverride w:val="1"/>
-    </w:lvlOverride>
-    <w:lvlOverride w:ilvl="1">
-      <w:startOverride w:val="1"/>
-    </w:lvlOverride>
-    <w:lvlOverride w:ilvl="2">
-      <w:startOverride w:val="1"/>
-    </w:lvlOverride>
-    <w:lvlOverride w:ilvl="3">
-      <w:startOverride w:val="1"/>
-    </w:lvlOverride>
-    <w:lvlOverride w:ilvl="4">
-      <w:startOverride w:val="1"/>
-    </w:lvlOverride>
-    <w:lvlOverride w:ilvl="5">
-      <w:startOverride w:val="1"/>
-    </w:lvlOverride>
-    <w:lvlOverride w:ilvl="6">
-      <w:startOverride w:val="1"/>
-    </w:lvlOverride>
-    <w:lvlOverride w:ilvl="7">
-      <w:startOverride w:val="1"/>
-    </w:lvlOverride>
-    <w:lvlOverride w:ilvl="8">
-      <w:startOverride w:val="1"/>
-    </w:lvlOverride>
+    <w:abstractNumId w:val="991"/>
   </w:num>
 </w:numbering>
 </file>

</xml_diff>

<commit_message>
Rewrite site prose and archive every previous page (#94)
* docs: rewrite site prose and preserve previous page versions

* docs: retain the explicit unbuilt mail-tier statement
</commit_message>
<xml_diff>
--- a/docs/word/KORUS.docx
+++ b/docs/word/KORUS.docx
@@ -28,7 +28,7 @@
         </w:p>
       </w:sdtContent>
     </w:sdt>
-    <w:bookmarkStart w:id="50" w:name="X382953dc9020c52bd9e5db31c5a25e22d4afae5"/>
+    <w:bookmarkStart w:id="53" w:name="X382953dc9020c52bd9e5db31c5a25e22d4afae5"/>
     <w:p>
       <w:pPr>
         <w:pStyle w:val="Heading1"/>
@@ -39,14 +39,38 @@
     </w:p>
     <w:p>
       <w:pPr>
-        <w:pStyle w:val="BlockText"/>
-      </w:pPr>
-      <w:r>
-        <w:rPr>
-          <w:b/>
-          <w:bCs/>
-        </w:rPr>
-        <w:t xml:space="preserve">Take a copy:</w:t>
+        <w:pStyle w:val="FirstParagraph"/>
+      </w:pPr>
+      <w:r>
+        <w:t xml:space="preserve">KORUS is the method I developed while using Claude Code on MessageFoundry.org, a major project I</w:t>
+      </w:r>
+      <w:r>
+        <w:t xml:space="preserve"> </w:t>
+      </w:r>
+      <w:r>
+        <w:t xml:space="preserve">started in late May, 2026. I'm a senior developer, and this account records what I learned through that work.</w:t>
+      </w:r>
+    </w:p>
+    <w:p>
+      <w:pPr>
+        <w:pStyle w:val="BodyText"/>
+      </w:pPr>
+      <w:r>
+        <w:t xml:space="preserve">The name means Keep One Repo, Unblock Sessions. I use separate coding sessions with clear jobs,</w:t>
+      </w:r>
+      <w:r>
+        <w:t xml:space="preserve"> </w:t>
+      </w:r>
+      <w:r>
+        <w:t xml:space="preserve">shared records, and checks that stop them disrupting each other's work.</w:t>
+      </w:r>
+    </w:p>
+    <w:p>
+      <w:pPr>
+        <w:pStyle w:val="BodyText"/>
+      </w:pPr>
+      <w:r>
+        <w:t xml:space="preserve">You can</w:t>
       </w:r>
       <w:r>
         <w:t xml:space="preserve"> </w:t>
@@ -56,14 +80,14 @@
           <w:rPr>
             <w:rStyle w:val="Hyperlink"/>
           </w:rPr>
-          <w:t xml:space="preserve">markdown</w:t>
+          <w:t xml:space="preserve">download this Markdown</w:t>
         </w:r>
       </w:hyperlink>
       <w:r>
         <w:t xml:space="preserve"> </w:t>
       </w:r>
       <w:r>
-        <w:t xml:space="preserve">or</w:t>
+        <w:t xml:space="preserve">or read the</w:t>
       </w:r>
       <w:r>
         <w:t xml:space="preserve"> </w:t>
@@ -73,98 +97,55 @@
           <w:rPr>
             <w:rStyle w:val="Hyperlink"/>
           </w:rPr>
-          <w:t xml:space="preserve">Word document</w:t>
+          <w:t xml:space="preserve">Word version</w:t>
         </w:r>
       </w:hyperlink>
       <w:r>
         <w:t xml:space="preserve">.</w:t>
       </w:r>
+      <w:r>
+        <w:t xml:space="preserve"> </w:t>
+      </w:r>
+      <w:r>
+        <w:t xml:space="preserve">The</w:t>
+      </w:r>
+      <w:r>
+        <w:t xml:space="preserve"> </w:t>
+      </w:r>
+      <w:hyperlink r:id="rId11">
+        <w:r>
+          <w:rPr>
+            <w:rStyle w:val="Hyperlink"/>
+          </w:rPr>
+          <w:t xml:space="preserve">previous Word version</w:t>
+        </w:r>
+      </w:hyperlink>
+      <w:r>
+        <w:t xml:space="preserve"> </w:t>
+      </w:r>
+      <w:r>
+        <w:t xml:space="preserve">is also available.</w:t>
+      </w:r>
+    </w:p>
+    <w:p>
+      <w:pPr>
+        <w:pStyle w:val="BodyText"/>
+      </w:pPr>
+    </w:p>
+    <w:bookmarkStart w:id="14" w:name="X07418a353def4e9d778ac597ca1291fde131307"/>
+    <w:p>
+      <w:pPr>
+        <w:pStyle w:val="Heading2"/>
+      </w:pPr>
+      <w:r>
+        <w:t xml:space="preserve">Start with the setup that fits your project</w:t>
+      </w:r>
     </w:p>
     <w:p>
       <w:pPr>
         <w:pStyle w:val="FirstParagraph"/>
       </w:pPr>
-      <w:r>
-        <w:t xml:space="preserve">Hello, I'm a senior developer working on a major project since late May, 2026.</w:t>
-      </w:r>
-      <w:r>
-        <w:t xml:space="preserve"> </w:t>
-      </w:r>
-      <w:r>
-        <w:t xml:space="preserve">(See MessageFoundry.org). This is a personally written summary of what I've learned.</w:t>
-      </w:r>
-    </w:p>
-    <w:p>
-      <w:pPr>
-        <w:pStyle w:val="BodyText"/>
-      </w:pPr>
-      <w:r>
-        <w:t xml:space="preserve">I call it</w:t>
-      </w:r>
-      <w:r>
-        <w:t xml:space="preserve"> </w:t>
-      </w:r>
-      <w:r>
-        <w:rPr>
-          <w:b/>
-          <w:bCs/>
-        </w:rPr>
-        <w:t xml:space="preserve">KORUS: Keep One Repo, Unblock Sessions</w:t>
-      </w:r>
-      <w:r>
-        <w:t xml:space="preserve">. That is the whole idea in four words:</w:t>
-      </w:r>
-      <w:r>
-        <w:t xml:space="preserve"> </w:t>
-      </w:r>
-      <w:r>
-        <w:t xml:space="preserve">everything below follows from keeping one repository and stopping the sessions blocking each other.</w:t>
-      </w:r>
-    </w:p>
-    <w:bookmarkStart w:id="13" w:name="bluftldr"/>
-    <w:p>
-      <w:pPr>
-        <w:pStyle w:val="Heading2"/>
-      </w:pPr>
-      <w:r>
-        <w:t xml:space="preserve">BLUF/TLDR</w:t>
-      </w:r>
-    </w:p>
-    <w:p>
-      <w:pPr>
-        <w:pStyle w:val="FirstParagraph"/>
-      </w:pPr>
-      <w:r>
-        <w:t xml:space="preserve">The following is a framework developed during months of Claude Code work. This document and this</w:t>
-      </w:r>
-      <w:r>
-        <w:t xml:space="preserve"> </w:t>
-      </w:r>
-      <w:r>
-        <w:t xml:space="preserve">site provide a starting point for new projects. This framework contains technical elements</w:t>
-      </w:r>
-      <w:r>
-        <w:t xml:space="preserve"> </w:t>
-      </w:r>
-      <w:r>
-        <w:t xml:space="preserve">supporting better AI coding.</w:t>
-      </w:r>
-    </w:p>
-    <w:p>
-      <w:pPr>
-        <w:pStyle w:val="BodyText"/>
-      </w:pPr>
-      <w:r>
-        <w:rPr>
-          <w:b/>
-          <w:bCs/>
-        </w:rPr>
-        <w:t xml:space="preserve">This page is the reasoning. If you want the commands, they are elsewhere:</w:t>
-      </w:r>
-      <w:r>
-        <w:t xml:space="preserve"> </w:t>
-      </w:r>
-      <w:hyperlink r:id="rId11">
+      <w:hyperlink r:id="rId12">
         <w:r>
           <w:rPr>
             <w:rStyle w:val="Hyperlink"/>
@@ -176,12 +157,12 @@
         <w:t xml:space="preserve"> </w:t>
       </w:r>
       <w:r>
-        <w:t xml:space="preserve">installs the enforcement, and</w:t>
-      </w:r>
-      <w:r>
-        <w:t xml:space="preserve"> </w:t>
-      </w:r>
-      <w:hyperlink r:id="rId12">
+        <w:t xml:space="preserve">installs the controls.</w:t>
+      </w:r>
+      <w:r>
+        <w:t xml:space="preserve"> </w:t>
+      </w:r>
+      <w:hyperlink r:id="rId13">
         <w:r>
           <w:rPr>
             <w:rStyle w:val="Hyperlink"/>
@@ -193,41 +174,39 @@
         <w:t xml:space="preserve"> </w:t>
       </w:r>
       <w:r>
-        <w:t xml:space="preserve">is the operating procedure for the session shape in section 6.</w:t>
-      </w:r>
-    </w:p>
-    <w:p>
-      <w:pPr>
-        <w:pStyle w:val="BodyText"/>
-      </w:pPr>
-      <w:r>
-        <w:rPr>
-          <w:b/>
-          <w:bCs/>
-        </w:rPr>
-        <w:t xml:space="preserve">Last reviewed 2026-08-16.</w:t>
-      </w:r>
-      <w:r>
-        <w:t xml:space="preserve"> </w:t>
-      </w:r>
-      <w:r>
-        <w:t xml:space="preserve">The model, pricing and client advice below is the part that rots:</w:t>
-      </w:r>
-      <w:r>
-        <w:t xml:space="preserve"> </w:t>
-      </w:r>
-      <w:r>
-        <w:t xml:space="preserve">check anything about plans, limits or model names against Anthropic's current documentation before</w:t>
-      </w:r>
-      <w:r>
-        <w:t xml:space="preserve"> </w:t>
-      </w:r>
-      <w:r>
-        <w:t xml:space="preserve">relying on it.</w:t>
-      </w:r>
-    </w:p>
-    <w:bookmarkEnd w:id="13"/>
-    <w:bookmarkStart w:id="14" w:name="korus-for-multi-session-ai-coding"/>
+        <w:t xml:space="preserve">explains the session roles and how to use them each day.</w:t>
+      </w:r>
+    </w:p>
+    <w:p>
+      <w:pPr>
+        <w:pStyle w:val="BodyText"/>
+      </w:pPr>
+      <w:r>
+        <w:t xml:space="preserve">This account's model and pricing advice was last reviewed on 2026-08-16. The recommendations came</w:t>
+      </w:r>
+      <w:r>
+        <w:t xml:space="preserve"> </w:t>
+      </w:r>
+      <w:r>
+        <w:t xml:space="preserve">from tools used as of 8/12/2026; they are historical observations, not a fresh review of available plans.</w:t>
+      </w:r>
+    </w:p>
+    <w:p>
+      <w:pPr>
+        <w:pStyle w:val="BodyText"/>
+      </w:pPr>
+      <w:r>
+        <w:t xml:space="preserve">Check current Anthropic documentation before choosing models, buying accounts, or relying on</w:t>
+      </w:r>
+      <w:r>
+        <w:t xml:space="preserve"> </w:t>
+      </w:r>
+      <w:r>
+        <w:t xml:space="preserve">client behavior. Later sections also retain dated changes to the roles.</w:t>
+      </w:r>
+    </w:p>
+    <w:bookmarkEnd w:id="14"/>
+    <w:bookmarkStart w:id="15" w:name="korus-for-multi-session-ai-coding"/>
     <w:p>
       <w:pPr>
         <w:pStyle w:val="Heading2"/>
@@ -241,159 +220,79 @@
         <w:pStyle w:val="FirstParagraph"/>
       </w:pPr>
       <w:r>
-        <w:t xml:space="preserve">Here is the shape of what I've learned.</w:t>
-      </w:r>
-    </w:p>
-    <w:p>
-      <w:pPr>
+        <w:t xml:space="preserve">My setup combined these choices:</w:t>
+      </w:r>
+    </w:p>
+    <w:p>
+      <w:pPr>
+        <w:pStyle w:val="Compact"/>
         <w:numPr>
           <w:ilvl w:val="0"/>
           <w:numId w:val="1001"/>
         </w:numPr>
       </w:pPr>
       <w:r>
-        <w:t xml:space="preserve">Use Claude Code with Ultracode mode.</w:t>
-      </w:r>
-    </w:p>
-    <w:p>
-      <w:pPr>
+        <w:t xml:space="preserve">Claude Code with Ultracode mode.</w:t>
+      </w:r>
+    </w:p>
+    <w:p>
+      <w:pPr>
+        <w:pStyle w:val="Compact"/>
         <w:numPr>
           <w:ilvl w:val="0"/>
           <w:numId w:val="1001"/>
         </w:numPr>
       </w:pPr>
       <w:r>
-        <w:t xml:space="preserve">For multisession coding, Claude Code for Desktop works better than the VS Code extension.</w:t>
-      </w:r>
-    </w:p>
-    <w:p>
-      <w:pPr>
+        <w:t xml:space="preserve">Claude Code for Desktop for work across sessions, with VS Code available for reading and editing code.</w:t>
+      </w:r>
+    </w:p>
+    <w:p>
+      <w:pPr>
+        <w:pStyle w:val="Compact"/>
         <w:numPr>
           <w:ilvl w:val="0"/>
           <w:numId w:val="1001"/>
         </w:numPr>
       </w:pPr>
       <w:r>
-        <w:t xml:space="preserve">Use one or more Claude Max 20x accounts instead of Teams or Enterprise pricing.</w:t>
-      </w:r>
-    </w:p>
-    <w:p>
-      <w:pPr>
+        <w:t xml:space="preserve">One or more Claude Max 20x accounts, chosen for their compute cost rather than enterprise management features.</w:t>
+      </w:r>
+    </w:p>
+    <w:p>
+      <w:pPr>
+        <w:pStyle w:val="Compact"/>
         <w:numPr>
           <w:ilvl w:val="0"/>
           <w:numId w:val="1001"/>
         </w:numPr>
       </w:pPr>
       <w:r>
-        <w:t xml:space="preserve">Set up the sessions:</w:t>
-      </w:r>
-    </w:p>
-    <w:p>
-      <w:pPr>
-        <w:numPr>
-          <w:ilvl w:val="0"/>
-          <w:numId w:val="1000"/>
-        </w:numPr>
-      </w:pPr>
-      <w:r>
-        <w:rPr>
-          <w:b/>
-          <w:bCs/>
-        </w:rPr>
-        <w:t xml:space="preserve">4.1.</w:t>
-      </w:r>
-      <w:r>
-        <w:t xml:space="preserve"> </w:t>
-      </w:r>
-      <w:r>
-        <w:t xml:space="preserve">A console, the one session you talk to. It reads the record, picks an item, writes a</w:t>
-      </w:r>
-      <w:r>
-        <w:t xml:space="preserve"> </w:t>
-      </w:r>
-      <w:r>
-        <w:t xml:space="preserve">short brief, and starts a builder for it.</w:t>
-      </w:r>
-    </w:p>
-    <w:p>
-      <w:pPr>
-        <w:numPr>
-          <w:ilvl w:val="0"/>
-          <w:numId w:val="1000"/>
-        </w:numPr>
-      </w:pPr>
-      <w:r>
-        <w:rPr>
-          <w:b/>
-          <w:bCs/>
-        </w:rPr>
-        <w:t xml:space="preserve">4.2.</w:t>
-      </w:r>
-      <w:r>
-        <w:t xml:space="preserve"> </w:t>
-      </w:r>
-      <w:r>
-        <w:t xml:space="preserve">A builder for each brief. It makes the change, commits, pushes, and opens the pull</w:t>
-      </w:r>
-      <w:r>
-        <w:t xml:space="preserve"> </w:t>
-      </w:r>
-      <w:r>
-        <w:t xml:space="preserve">request, then its process exits.</w:t>
-      </w:r>
-    </w:p>
-    <w:p>
-      <w:pPr>
-        <w:numPr>
-          <w:ilvl w:val="0"/>
-          <w:numId w:val="1000"/>
-        </w:numPr>
-      </w:pPr>
-      <w:r>
-        <w:rPr>
-          <w:b/>
-          <w:bCs/>
-        </w:rPr>
-        <w:t xml:space="preserve">4.3.</w:t>
-      </w:r>
-      <w:r>
-        <w:t xml:space="preserve"> </w:t>
-      </w:r>
-      <w:r>
-        <w:t xml:space="preserve">A lander session, which decides what enters the merge queue and in what order.</w:t>
-      </w:r>
-    </w:p>
-    <w:p>
-      <w:pPr>
-        <w:numPr>
-          <w:ilvl w:val="0"/>
-          <w:numId w:val="1000"/>
-        </w:numPr>
-      </w:pPr>
-      <w:r>
-        <w:t xml:space="preserve">There are additional, optional sessions as described below.</w:t>
-      </w:r>
-    </w:p>
-    <w:p>
-      <w:pPr>
+        <w:t xml:space="preserve">A console to write briefs, a builder per brief, and a lander to manage the merge queue.</w:t>
+      </w:r>
+    </w:p>
+    <w:p>
+      <w:pPr>
+        <w:pStyle w:val="Compact"/>
         <w:numPr>
           <w:ilvl w:val="0"/>
           <w:numId w:val="1001"/>
         </w:numPr>
       </w:pPr>
       <w:r>
-        <w:t xml:space="preserve">Use worktrees with hooks enforcing Claude Code's behavior.</w:t>
-      </w:r>
-    </w:p>
-    <w:p>
-      <w:pPr>
+        <w:t xml:space="preserve">Worktrees and hooks to enforce the rules that prompts alone did not hold.</w:t>
+      </w:r>
+    </w:p>
+    <w:p>
+      <w:pPr>
+        <w:pStyle w:val="Compact"/>
         <w:numPr>
           <w:ilvl w:val="0"/>
           <w:numId w:val="1001"/>
         </w:numPr>
       </w:pPr>
       <w:r>
-        <w:t xml:space="preserve">Use the Kynet method to enable inter-session communication (see below).</w:t>
+        <w:t xml:space="preserve">The Kynet method for communication between sessions, described in section 8.</w:t>
       </w:r>
     </w:p>
     <w:p>
@@ -401,17 +300,17 @@
         <w:pStyle w:val="FirstParagraph"/>
       </w:pPr>
       <w:r>
-        <w:t xml:space="preserve">I'll go through each of those and more in the following sections. Note: these recommendations are</w:t>
-      </w:r>
-      <w:r>
-        <w:t xml:space="preserve"> </w:t>
-      </w:r>
-      <w:r>
-        <w:t xml:space="preserve">based on the Claude tools as of 8/12/2026. Things will change as Anthropic releases improvements.</w:t>
-      </w:r>
-    </w:p>
-    <w:bookmarkEnd w:id="14"/>
-    <w:bookmarkStart w:id="17" w:name="Xe4435a1d6436f1737b1b6caba610c8f95c0821f"/>
+        <w:t xml:space="preserve">The reviewer and regulator roles add checks around the builders' work. The sections below explain</w:t>
+      </w:r>
+      <w:r>
+        <w:t xml:space="preserve"> </w:t>
+      </w:r>
+      <w:r>
+        <w:t xml:space="preserve">the choices and their limits.</w:t>
+      </w:r>
+    </w:p>
+    <w:bookmarkEnd w:id="15"/>
+    <w:bookmarkStart w:id="18" w:name="Xe4435a1d6436f1737b1b6caba610c8f95c0821f"/>
     <w:p>
       <w:pPr>
         <w:pStyle w:val="Heading2"/>
@@ -424,7 +323,13 @@
       <w:pPr>
         <w:pStyle w:val="FirstParagraph"/>
       </w:pPr>
-      <w:hyperlink r:id="rId15">
+      <w:r>
+        <w:t xml:space="preserve">I found</w:t>
+      </w:r>
+      <w:r>
+        <w:t xml:space="preserve"> </w:t>
+      </w:r>
+      <w:hyperlink r:id="rId16">
         <w:r>
           <w:rPr>
             <w:rStyle w:val="Hyperlink"/>
@@ -436,18 +341,20 @@
         <w:t xml:space="preserve"> </w:t>
       </w:r>
       <w:r>
-        <w:t xml:space="preserve">produces better results. Enabling it empowers Claude to launch workflows, which are a key part of</w:t>
-      </w:r>
-      <w:r>
-        <w:t xml:space="preserve"> </w:t>
-      </w:r>
-      <w:r>
-        <w:t xml:space="preserve">this method. Workflows break the task into assignments handed to subagents. Ultracode also triggers</w:t>
-      </w:r>
-      <w:r>
-        <w:t xml:space="preserve"> </w:t>
-      </w:r>
-      <w:hyperlink r:id="rId16">
+        <w:t xml:space="preserve">useful because it lets Claude launch workflows. A workflow breaks a task into assignments for subagents.</w:t>
+      </w:r>
+    </w:p>
+    <w:p>
+      <w:pPr>
+        <w:pStyle w:val="BodyText"/>
+      </w:pPr>
+      <w:r>
+        <w:t xml:space="preserve">It also triggers</w:t>
+      </w:r>
+      <w:r>
+        <w:t xml:space="preserve"> </w:t>
+      </w:r>
+      <w:hyperlink r:id="rId17">
         <w:r>
           <w:rPr>
             <w:rStyle w:val="Hyperlink"/>
@@ -462,53 +369,53 @@
         <w:t xml:space="preserve"> </w:t>
       </w:r>
       <w:r>
-        <w:t xml:space="preserve">producing better results.</w:t>
-      </w:r>
-    </w:p>
-    <w:p>
-      <w:pPr>
-        <w:pStyle w:val="BodyText"/>
-      </w:pPr>
-      <w:r>
-        <w:t xml:space="preserve">Opus 5 is presently the best mode for creating strong code. It is even slightly better than Fable 5</w:t>
-      </w:r>
-      <w:r>
-        <w:t xml:space="preserve"> </w:t>
-      </w:r>
-      <w:r>
-        <w:t xml:space="preserve">at creating code and at half the price.</w:t>
-      </w:r>
-    </w:p>
-    <w:p>
-      <w:pPr>
-        <w:pStyle w:val="BodyText"/>
-      </w:pPr>
-      <w:r>
-        <w:t xml:space="preserve">Unfortunately, using Ultracode and Opus 5 together is slow. The result is worth the wait, having</w:t>
-      </w:r>
-      <w:r>
-        <w:t xml:space="preserve"> </w:t>
-      </w:r>
-      <w:r>
-        <w:t xml:space="preserve">fewer bugs to resolve later.</w:t>
-      </w:r>
-    </w:p>
-    <w:p>
-      <w:pPr>
-        <w:pStyle w:val="BodyText"/>
-      </w:pPr>
-      <w:r>
-        <w:t xml:space="preserve">That multisession method makes good use of the wait time. Since you are administering eight</w:t>
-      </w:r>
-      <w:r>
-        <w:t xml:space="preserve"> </w:t>
-      </w:r>
-      <w:r>
-        <w:t xml:space="preserve">workflows, there's usually something for you to decide.</w:t>
-      </w:r>
-    </w:p>
-    <w:bookmarkEnd w:id="17"/>
-    <w:bookmarkStart w:id="19" w:name="X8bb53164f71da1d081458c229f1305b01be35be"/>
+        <w:t xml:space="preserve">which helped catch mistakes in my work.</w:t>
+      </w:r>
+    </w:p>
+    <w:p>
+      <w:pPr>
+        <w:pStyle w:val="BodyText"/>
+      </w:pPr>
+      <w:r>
+        <w:t xml:space="preserve">At the time of this account, I preferred Opus 5 for code. In my experience it produced slightly</w:t>
+      </w:r>
+      <w:r>
+        <w:t xml:space="preserve"> </w:t>
+      </w:r>
+      <w:r>
+        <w:t xml:space="preserve">better code than Fable 5 at half the price.</w:t>
+      </w:r>
+    </w:p>
+    <w:p>
+      <w:pPr>
+        <w:pStyle w:val="BodyText"/>
+      </w:pPr>
+      <w:r>
+        <w:t xml:space="preserve">Ultracode with Opus 5 was slow, but I spent less time fixing bugs afterward. Running several</w:t>
+      </w:r>
+      <w:r>
+        <w:t xml:space="preserve"> </w:t>
+      </w:r>
+      <w:r>
+        <w:t xml:space="preserve">sessions gave me other work to review during those waits.</w:t>
+      </w:r>
+    </w:p>
+    <w:p>
+      <w:pPr>
+        <w:pStyle w:val="BodyText"/>
+      </w:pPr>
+      <w:r>
+        <w:t xml:space="preserve">With eight workflows active, there was usually a decision waiting for me. That describes my</w:t>
+      </w:r>
+      <w:r>
+        <w:t xml:space="preserve"> </w:t>
+      </w:r>
+      <w:r>
+        <w:t xml:space="preserve">workload, not a measured speed advantage over one session.</w:t>
+      </w:r>
+    </w:p>
+    <w:bookmarkEnd w:id="18"/>
+    <w:bookmarkStart w:id="20" w:name="X8bb53164f71da1d081458c229f1305b01be35be"/>
     <w:p>
       <w:pPr>
         <w:pStyle w:val="Heading2"/>
@@ -522,60 +429,40 @@
         <w:pStyle w:val="FirstParagraph"/>
       </w:pPr>
       <w:r>
-        <w:t xml:space="preserve">Claude's desktop application is the best at empowering intersession communication. The VS Code</w:t>
-      </w:r>
-      <w:r>
-        <w:t xml:space="preserve"> </w:t>
-      </w:r>
-      <w:r>
-        <w:t xml:space="preserve">extension lacks the strongest implementation of these as of 8/2026. As a result, running multiple</w:t>
-      </w:r>
-      <w:r>
-        <w:t xml:space="preserve"> </w:t>
-      </w:r>
-      <w:r>
-        <w:t xml:space="preserve">sessions inside of VS Code generates code collisions.</w:t>
-      </w:r>
-    </w:p>
-    <w:p>
-      <w:pPr>
-        <w:pStyle w:val="BodyText"/>
-      </w:pPr>
-      <w:r>
-        <w:t xml:space="preserve">The desktop app, however, makes it difficult to see the final code. In VS Code, you always are a</w:t>
-      </w:r>
-      <w:r>
-        <w:t xml:space="preserve"> </w:t>
-      </w:r>
-      <w:r>
-        <w:t xml:space="preserve">click away from the current codebase.</w:t>
-      </w:r>
-    </w:p>
-    <w:p>
-      <w:pPr>
-        <w:pStyle w:val="BodyText"/>
-      </w:pPr>
-      <w:r>
-        <w:t xml:space="preserve">You might find it helpful to have a VS Code instance running alongside your Claude desktop app. Use</w:t>
-      </w:r>
-      <w:r>
-        <w:t xml:space="preserve"> </w:t>
-      </w:r>
-      <w:r>
-        <w:t xml:space="preserve">the desktop app to generate the code and the VS Code to review and make manual edits.</w:t>
-      </w:r>
-    </w:p>
-    <w:p>
-      <w:pPr>
-        <w:pStyle w:val="BodyText"/>
-      </w:pPr>
-      <w:r>
-        <w:t xml:space="preserve">If you run more than one Claude account, set them up first:</w:t>
-      </w:r>
-      <w:r>
-        <w:t xml:space="preserve"> </w:t>
-      </w:r>
-      <w:hyperlink r:id="rId18">
+        <w:t xml:space="preserve">In 8/2026, I found the desktop app better at communication between sessions than the VS Code</w:t>
+      </w:r>
+      <w:r>
+        <w:t xml:space="preserve"> </w:t>
+      </w:r>
+      <w:r>
+        <w:t xml:space="preserve">extension. Multiple sessions in the extension had caused code collisions.</w:t>
+      </w:r>
+    </w:p>
+    <w:p>
+      <w:pPr>
+        <w:pStyle w:val="BodyText"/>
+      </w:pPr>
+      <w:r>
+        <w:t xml:space="preserve">VS Code made it easier to inspect the code itself. I kept it open alongside the desktop app:</w:t>
+      </w:r>
+      <w:r>
+        <w:t xml:space="preserve"> </w:t>
+      </w:r>
+      <w:r>
+        <w:t xml:space="preserve">Claude generated changes in the desktop app, and I reviewed or edited them in VS Code.</w:t>
+      </w:r>
+    </w:p>
+    <w:p>
+      <w:pPr>
+        <w:pStyle w:val="BodyText"/>
+      </w:pPr>
+      <w:r>
+        <w:t xml:space="preserve">If you use several Claude accounts,</w:t>
+      </w:r>
+      <w:r>
+        <w:t xml:space="preserve"> </w:t>
+      </w:r>
+      <w:hyperlink r:id="rId19">
         <w:r>
           <w:rPr>
             <w:rStyle w:val="Hyperlink"/>
@@ -587,17 +474,17 @@
         <w:t xml:space="preserve"> </w:t>
       </w:r>
       <w:r>
-        <w:t xml:space="preserve">covers one desktop instance per account, and the config root</w:t>
-      </w:r>
-      <w:r>
-        <w:t xml:space="preserve"> </w:t>
-      </w:r>
-      <w:r>
-        <w:t xml:space="preserve">each one adds.</w:t>
-      </w:r>
-    </w:p>
-    <w:bookmarkEnd w:id="19"/>
-    <w:bookmarkStart w:id="24" w:name="Xbf516e5646b002c3242b38238c46d10caad39f1"/>
+        <w:t xml:space="preserve">explains how to set up</w:t>
+      </w:r>
+      <w:r>
+        <w:t xml:space="preserve"> </w:t>
+      </w:r>
+      <w:r>
+        <w:t xml:space="preserve">one desktop instance per account and the config root each instance adds.</w:t>
+      </w:r>
+    </w:p>
+    <w:bookmarkEnd w:id="20"/>
+    <w:bookmarkStart w:id="25" w:name="Xbf516e5646b002c3242b38238c46d10caad39f1"/>
     <w:p>
       <w:pPr>
         <w:pStyle w:val="Heading2"/>
@@ -611,134 +498,93 @@
         <w:pStyle w:val="FirstParagraph"/>
       </w:pPr>
       <w:r>
-        <w:t xml:space="preserve">Yes, that header is correct: Claude's Max 20x accounts offer AI compute at 60x cheaper than the</w:t>
-      </w:r>
-      <w:r>
-        <w:t xml:space="preserve"> </w:t>
-      </w:r>
-      <w:r>
-        <w:t xml:space="preserve">undiscounted API rates you pay under Teams or Enterprise plans.</w:t>
-      </w:r>
-      <w:r>
-        <w:t xml:space="preserve"> </w:t>
-      </w:r>
-      <w:r>
-        <w:rPr>
-          <w:b/>
-          <w:bCs/>
-        </w:rPr>
-        <w:t xml:space="preserve">If you bought the same compute Max</w:t>
-      </w:r>
-      <w:r>
-        <w:rPr>
-          <w:b/>
-          <w:bCs/>
-        </w:rPr>
-        <w:t xml:space="preserve"> </w:t>
-      </w:r>
-      <w:r>
-        <w:rPr>
-          <w:b/>
-          <w:bCs/>
-        </w:rPr>
-        <w:t xml:space="preserve">20x gives you under API pricing, it would cost about $12,000.</w:t>
-      </w:r>
-      <w:r>
-        <w:t xml:space="preserve"> </w:t>
-      </w:r>
-      <w:r>
-        <w:t xml:space="preserve">For details, see</w:t>
-      </w:r>
-      <w:r>
-        <w:t xml:space="preserve"> </w:t>
-      </w:r>
-      <w:hyperlink r:id="rId20">
-        <w:r>
-          <w:rPr>
-            <w:rStyle w:val="Hyperlink"/>
-          </w:rPr>
-          <w:t xml:space="preserve">Token Accounting</w:t>
-        </w:r>
-      </w:hyperlink>
-      <w:r>
-        <w:t xml:space="preserve">.</w:t>
-      </w:r>
-    </w:p>
-    <w:p>
-      <w:pPr>
-        <w:pStyle w:val="BodyText"/>
-      </w:pPr>
-      <w:r>
-        <w:t xml:space="preserve">As a result, the Max 20x plan is the best way to affordably create your application. The individual</w:t>
-      </w:r>
-      <w:r>
-        <w:t xml:space="preserve"> </w:t>
-      </w:r>
-      <w:r>
-        <w:t xml:space="preserve">accounts lack the enterprise management features but can save you thousands.</w:t>
-      </w:r>
-    </w:p>
-    <w:p>
-      <w:pPr>
-        <w:pStyle w:val="BodyText"/>
-      </w:pPr>
-      <w:r>
-        <w:t xml:space="preserve">You may require multiple Max 20x accounts to cover a week of heavy development. You can sign up for</w:t>
-      </w:r>
-      <w:r>
-        <w:t xml:space="preserve"> </w:t>
-      </w:r>
-      <w:r>
-        <w:t xml:space="preserve">as many $200 per month accounts as you want, just use different email addresses.</w:t>
-      </w:r>
-    </w:p>
-    <w:p>
-      <w:pPr>
-        <w:pStyle w:val="BodyText"/>
-      </w:pPr>
-      <w:r>
-        <w:rPr>
-          <w:b/>
-          <w:bCs/>
-        </w:rPr>
-        <w:t xml:space="preserve">Check this against the current terms yourself before you rely on it.</w:t>
-      </w:r>
-      <w:r>
-        <w:t xml:space="preserve"> </w:t>
-      </w:r>
-      <w:r>
-        <w:t xml:space="preserve">I believe separate accounts</w:t>
-      </w:r>
-      <w:r>
-        <w:t xml:space="preserve"> </w:t>
-      </w:r>
-      <w:r>
-        <w:t xml:space="preserve">on separate email addresses are within the terms, and that belief is mine rather than a citation: I</w:t>
-      </w:r>
-      <w:r>
-        <w:t xml:space="preserve"> </w:t>
-      </w:r>
-      <w:r>
-        <w:t xml:space="preserve">am not a lawyer, and these documents change. The ones that govern it are Anthropic's</w:t>
-      </w:r>
-      <w:r>
-        <w:t xml:space="preserve"> </w:t>
-      </w:r>
+        <w:t xml:space="preserve">The original account valued a Max 20x plan's compute at about $12,000 at undiscounted API rates,</w:t>
+      </w:r>
+      <w:r>
+        <w:t xml:space="preserve"> </w:t>
+      </w:r>
+      <w:r>
+        <w:t xml:space="preserve">compared with a $200 monthly subscription. That is the basis for the reported 60x comparison.</w:t>
+      </w:r>
+    </w:p>
+    <w:p>
+      <w:pPr>
+        <w:pStyle w:val="BodyText"/>
+      </w:pPr>
       <w:hyperlink r:id="rId21">
         <w:r>
           <w:rPr>
             <w:rStyle w:val="Hyperlink"/>
           </w:rPr>
-          <w:t xml:space="preserve">Usage Policy</w:t>
+          <w:t xml:space="preserve">Token accounting</w:t>
         </w:r>
       </w:hyperlink>
       <w:r>
+        <w:t xml:space="preserve"> </w:t>
+      </w:r>
+      <w:r>
+        <w:t xml:space="preserve">explains the calculation and its limits. The comparison</w:t>
+      </w:r>
+      <w:r>
+        <w:t xml:space="preserve"> </w:t>
+      </w:r>
+      <w:r>
+        <w:t xml:space="preserve">used the undiscounted API rates associated with Teams or Enterprise pricing in that account.</w:t>
+      </w:r>
+    </w:p>
+    <w:p>
+      <w:pPr>
+        <w:pStyle w:val="BodyText"/>
+      </w:pPr>
+      <w:r>
+        <w:t xml:space="preserve">Individual accounts lack enterprise management features. In my workload, their lower compute cost</w:t>
+      </w:r>
+      <w:r>
+        <w:t xml:space="preserve"> </w:t>
+      </w:r>
+      <w:r>
+        <w:t xml:space="preserve">could save thousands, and more than one account could cover a week of heavy development.</w:t>
+      </w:r>
+    </w:p>
+    <w:p>
+      <w:pPr>
+        <w:pStyle w:val="BodyText"/>
+      </w:pPr>
+      <w:r>
+        <w:t xml:space="preserve">I believed separate accounts with separate email addresses were allowed, with no stated account</w:t>
+      </w:r>
+      <w:r>
+        <w:t xml:space="preserve"> </w:t>
+      </w:r>
+      <w:r>
+        <w:t xml:space="preserve">count limit. That was my reading, not legal advice or a cited permission; I am not a lawyer.</w:t>
+      </w:r>
+    </w:p>
+    <w:p>
+      <w:pPr>
+        <w:pStyle w:val="BodyText"/>
+      </w:pPr>
+      <w:r>
+        <w:t xml:space="preserve">Check</w:t>
+      </w:r>
+      <w:r>
+        <w:t xml:space="preserve"> </w:t>
+      </w:r>
+      <w:hyperlink r:id="rId22">
+        <w:r>
+          <w:rPr>
+            <w:rStyle w:val="Hyperlink"/>
+          </w:rPr>
+          <w:t xml:space="preserve">Anthropic's Usage Policy</w:t>
+        </w:r>
+      </w:hyperlink>
+      <w:r>
         <w:t xml:space="preserve">,</w:t>
       </w:r>
       <w:r>
         <w:t xml:space="preserve"> </w:t>
       </w:r>
-      <w:hyperlink r:id="rId22">
+      <w:hyperlink r:id="rId23">
         <w:r>
           <w:rPr>
             <w:rStyle w:val="Hyperlink"/>
@@ -752,88 +598,85 @@
       <w:r>
         <w:t xml:space="preserve"> </w:t>
       </w:r>
-      <w:hyperlink r:id="rId23">
+      <w:hyperlink r:id="rId24">
         <w:r>
           <w:rPr>
             <w:rStyle w:val="Hyperlink"/>
           </w:rPr>
-          <w:t xml:space="preserve">the Claude Code plan guidance</w:t>
+          <w:t xml:space="preserve">Claude Code plan guidance</w:t>
         </w:r>
       </w:hyperlink>
       <w:r>
-        <w:t xml:space="preserve">.</w:t>
-      </w:r>
-      <w:r>
-        <w:t xml:space="preserve"> </w:t>
-      </w:r>
-      <w:r>
-        <w:t xml:space="preserve">What is definitely not allowed is sharing one account between people.</w:t>
-      </w:r>
-    </w:p>
-    <w:p>
-      <w:pPr>
-        <w:pStyle w:val="BodyText"/>
-      </w:pPr>
-      <w:r>
-        <w:t xml:space="preserve">Max 20x limits your usage through five-hour session and weekly usage caps. Generally, 1% of weekly</w:t>
-      </w:r>
-      <w:r>
-        <w:t xml:space="preserve"> </w:t>
-      </w:r>
-      <w:r>
-        <w:t xml:space="preserve">usage equals about 5% of session usage.</w:t>
-      </w:r>
-    </w:p>
-    <w:p>
-      <w:pPr>
-        <w:pStyle w:val="BodyText"/>
-      </w:pPr>
-      <w:r>
-        <w:t xml:space="preserve">The per-session usage limits are a key factor in my recommendations. If you keep about eight build</w:t>
-      </w:r>
-      <w:r>
-        <w:t xml:space="preserve"> </w:t>
-      </w:r>
-      <w:r>
-        <w:t xml:space="preserve">tasks running at a time, you'll normally run under the session limits. You'll use up your weekly</w:t>
-      </w:r>
-      <w:r>
-        <w:t xml:space="preserve"> </w:t>
-      </w:r>
-      <w:r>
-        <w:t xml:space="preserve">limit in about two days.</w:t>
-      </w:r>
-    </w:p>
-    <w:p>
-      <w:pPr>
-        <w:pStyle w:val="BodyText"/>
-      </w:pPr>
-      <w:r>
-        <w:t xml:space="preserve">Splitting those tasks into separate sessions costs some intersession communication. It costs</w:t>
-      </w:r>
-      <w:r>
-        <w:t xml:space="preserve"> </w:t>
-      </w:r>
-      <w:r>
-        <w:t xml:space="preserve">nothing to leave a session idle once it has ended its turn.</w:t>
-      </w:r>
-    </w:p>
-    <w:p>
-      <w:pPr>
-        <w:pStyle w:val="BodyText"/>
-      </w:pPr>
-      <w:r>
-        <w:t xml:space="preserve">If you run tasks that fan out into many-agent workflows, especially /deep-research work, you'll</w:t>
-      </w:r>
-      <w:r>
-        <w:t xml:space="preserve"> </w:t>
-      </w:r>
-      <w:r>
-        <w:t xml:space="preserve">need to reduce the number of tasks running.</w:t>
-      </w:r>
-    </w:p>
-    <w:bookmarkEnd w:id="24"/>
-    <w:bookmarkStart w:id="25" w:name="X48031ae3eb3229342e6c438e9ce63589a721148"/>
+        <w:t xml:space="preserve"> </w:t>
+      </w:r>
+      <w:r>
+        <w:t xml:space="preserve">before relying on it.</w:t>
+      </w:r>
+    </w:p>
+    <w:p>
+      <w:pPr>
+        <w:pStyle w:val="BodyText"/>
+      </w:pPr>
+      <w:r>
+        <w:t xml:space="preserve">The original guidance prohibited sharing one account between people.</w:t>
+      </w:r>
+    </w:p>
+    <w:p>
+      <w:pPr>
+        <w:pStyle w:val="BodyText"/>
+      </w:pPr>
+      <w:r>
+        <w:t xml:space="preserve">Max 20x applied both five-hour session caps and weekly caps. In my observations, 1% of weekly</w:t>
+      </w:r>
+      <w:r>
+        <w:t xml:space="preserve"> </w:t>
+      </w:r>
+      <w:r>
+        <w:t xml:space="preserve">usage was roughly 5% of session usage.</w:t>
+      </w:r>
+    </w:p>
+    <w:p>
+      <w:pPr>
+        <w:pStyle w:val="BodyText"/>
+      </w:pPr>
+      <w:r>
+        <w:t xml:space="preserve">About eight build tasks at a time usually stayed under my session limit. That workload used the</w:t>
+      </w:r>
+      <w:r>
+        <w:t xml:space="preserve"> </w:t>
+      </w:r>
+      <w:r>
+        <w:t xml:space="preserve">weekly allowance in about two days.</w:t>
+      </w:r>
+    </w:p>
+    <w:p>
+      <w:pPr>
+        <w:pStyle w:val="BodyText"/>
+      </w:pPr>
+      <w:r>
+        <w:t xml:space="preserve">Separate sessions require some communication, but an idle session consumes no further compute</w:t>
+      </w:r>
+      <w:r>
+        <w:t xml:space="preserve"> </w:t>
+      </w:r>
+      <w:r>
+        <w:t xml:space="preserve">after its turn ends. Tasks that launch many agents, especially</w:t>
+      </w:r>
+      <w:r>
+        <w:t xml:space="preserve"> </w:t>
+      </w:r>
+      <w:r>
+        <w:rPr>
+          <w:rStyle w:val="VerbatimChar"/>
+        </w:rPr>
+        <w:t xml:space="preserve">/deep-research</w:t>
+      </w:r>
+      <w:r>
+        <w:t xml:space="preserve">, require fewer concurrent tasks.</w:t>
+      </w:r>
+    </w:p>
+    <w:bookmarkEnd w:id="25"/>
+    <w:bookmarkStart w:id="26" w:name="X48031ae3eb3229342e6c438e9ce63589a721148"/>
     <w:p>
       <w:pPr>
         <w:pStyle w:val="Heading2"/>
@@ -847,17 +690,17 @@
         <w:pStyle w:val="FirstParagraph"/>
       </w:pPr>
       <w:r>
-        <w:t xml:space="preserve">Have Claude Code create a project backlog. Then tell it to add things as they come up. Later, tell</w:t>
-      </w:r>
-      <w:r>
-        <w:t xml:space="preserve"> </w:t>
-      </w:r>
-      <w:r>
-        <w:t xml:space="preserve">the console session to create a plan for building down that backlog.</w:t>
-      </w:r>
-    </w:p>
-    <w:bookmarkEnd w:id="25"/>
-    <w:bookmarkStart w:id="30" w:name="X5ff9aeb0a54af642673c4763573e548d03ef2d1"/>
+        <w:t xml:space="preserve">Ask Claude Code to create a project backlog and add new work as it comes up. Have the console use</w:t>
+      </w:r>
+      <w:r>
+        <w:t xml:space="preserve"> </w:t>
+      </w:r>
+      <w:r>
+        <w:t xml:space="preserve">that backlog when it plans the next build tasks.</w:t>
+      </w:r>
+    </w:p>
+    <w:bookmarkEnd w:id="26"/>
+    <w:bookmarkStart w:id="31" w:name="X5ff9aeb0a54af642673c4763573e548d03ef2d1"/>
     <w:p>
       <w:pPr>
         <w:pStyle w:val="Heading2"/>
@@ -866,7 +709,7 @@
         <w:t xml:space="preserve">5. Documentation</w:t>
       </w:r>
     </w:p>
-    <w:bookmarkStart w:id="26" w:name="Xc4a89930dc259e99f9621cc0ce6d28e12a6abc5"/>
+    <w:bookmarkStart w:id="27" w:name="Xc4a89930dc259e99f9621cc0ce6d28e12a6abc5"/>
     <w:p>
       <w:pPr>
         <w:pStyle w:val="Heading3"/>
@@ -880,23 +723,31 @@
         <w:pStyle w:val="FirstParagraph"/>
       </w:pPr>
       <w:r>
-        <w:t xml:space="preserve">Have Claude create ADR documents for each significant build. When you ask the console session to</w:t>
-      </w:r>
-      <w:r>
-        <w:t xml:space="preserve"> </w:t>
-      </w:r>
-      <w:r>
-        <w:t xml:space="preserve">create a plan, just tell it to be sure to create ADRs as needed. This gives you a build record for</w:t>
-      </w:r>
-      <w:r>
-        <w:t xml:space="preserve"> </w:t>
-      </w:r>
-      <w:r>
-        <w:t xml:space="preserve">your CISO and any auditor. It also provides ongoing context for the AI.</w:t>
-      </w:r>
-    </w:p>
-    <w:bookmarkEnd w:id="26"/>
-    <w:bookmarkStart w:id="28" w:name="Xa3d08fb593ea8c8eb35229563c5295c44c50a37"/>
+        <w:t xml:space="preserve">Create architecture decision records (ADRs) for significant build decisions. Include that</w:t>
+      </w:r>
+      <w:r>
+        <w:t xml:space="preserve"> </w:t>
+      </w:r>
+      <w:r>
+        <w:t xml:space="preserve">requirement when you ask the console to make a plan.</w:t>
+      </w:r>
+    </w:p>
+    <w:p>
+      <w:pPr>
+        <w:pStyle w:val="BodyText"/>
+      </w:pPr>
+      <w:r>
+        <w:t xml:space="preserve">The records give the AI ongoing context. They also give your security lead and auditors a history</w:t>
+      </w:r>
+      <w:r>
+        <w:t xml:space="preserve"> </w:t>
+      </w:r>
+      <w:r>
+        <w:t xml:space="preserve">of the decisions behind the build.</w:t>
+      </w:r>
+    </w:p>
+    <w:bookmarkEnd w:id="27"/>
+    <w:bookmarkStart w:id="29" w:name="Xa3d08fb593ea8c8eb35229563c5295c44c50a37"/>
     <w:p>
       <w:pPr>
         <w:pStyle w:val="Heading3"/>
@@ -909,32 +760,37 @@
       <w:pPr>
         <w:pStyle w:val="FirstParagraph"/>
       </w:pPr>
-      <w:r>
-        <w:t xml:space="preserve">GitHub's Spec Kit is a strong starting point for SDD (Spec-Driven Development). It is an antidote to</w:t>
-      </w:r>
-      <w:r>
-        <w:t xml:space="preserve"> </w:t>
-      </w:r>
-      <w:r>
-        <w:t xml:space="preserve">vibe coding's flaws. See</w:t>
-      </w:r>
-      <w:r>
-        <w:t xml:space="preserve"> </w:t>
-      </w:r>
-      <w:hyperlink r:id="rId27">
+      <w:hyperlink r:id="rId28">
         <w:r>
           <w:rPr>
             <w:rStyle w:val="Hyperlink"/>
           </w:rPr>
-          <w:t xml:space="preserve">this Spec Kit page</w:t>
+          <w:t xml:space="preserve">GitHub Spec Kit</w:t>
         </w:r>
       </w:hyperlink>
       <w:r>
-        <w:t xml:space="preserve">.</w:t>
-      </w:r>
-    </w:p>
-    <w:bookmarkEnd w:id="28"/>
-    <w:bookmarkStart w:id="29" w:name="Xf099d6434e8bc2802e61e9fcd1379b29e44876b"/>
+        <w:t xml:space="preserve"> </w:t>
+      </w:r>
+      <w:r>
+        <w:t xml:space="preserve">helps structure spec-driven development: agree on what to</w:t>
+      </w:r>
+      <w:r>
+        <w:t xml:space="preserve"> </w:t>
+      </w:r>
+      <w:r>
+        <w:t xml:space="preserve">build, then use that specification to guide implementation.</w:t>
+      </w:r>
+    </w:p>
+    <w:p>
+      <w:pPr>
+        <w:pStyle w:val="BodyText"/>
+      </w:pPr>
+      <w:r>
+        <w:t xml:space="preserve">I use it to reduce the gaps left by open-ended coding prompts.</w:t>
+      </w:r>
+    </w:p>
+    <w:bookmarkEnd w:id="29"/>
+    <w:bookmarkStart w:id="30" w:name="Xf099d6434e8bc2802e61e9fcd1379b29e44876b"/>
     <w:p>
       <w:pPr>
         <w:pStyle w:val="Heading3"/>
@@ -948,58 +804,75 @@
         <w:pStyle w:val="FirstParagraph"/>
       </w:pPr>
       <w:r>
-        <w:t xml:space="preserve">OWASP's ASVS 5 framework is a great way to harden your application against hackers. There are three</w:t>
-      </w:r>
-      <w:r>
-        <w:t xml:space="preserve"> </w:t>
-      </w:r>
-      <w:r>
-        <w:t xml:space="preserve">security levels depending on what your application touches.</w:t>
-      </w:r>
-    </w:p>
-    <w:p>
-      <w:pPr>
-        <w:pStyle w:val="BodyText"/>
-      </w:pPr>
-      <w:r>
-        <w:t xml:space="preserve">Have Claude create a register of your ASVS scores. Be sure it works against the exact wording of</w:t>
-      </w:r>
-      <w:r>
-        <w:t xml:space="preserve"> </w:t>
-      </w:r>
-      <w:r>
-        <w:t xml:space="preserve">ASVS 5, not against summaries Claude creates or gets from other sources.</w:t>
-      </w:r>
-    </w:p>
-    <w:p>
-      <w:pPr>
-        <w:pStyle w:val="BodyText"/>
-      </w:pPr>
-      <w:r>
-        <w:t xml:space="preserve">Then, have Claude anchor your ASVS scores against sym/ctx anchors. Don't point at a line number in</w:t>
-      </w:r>
-      <w:r>
-        <w:t xml:space="preserve"> </w:t>
-      </w:r>
-      <w:r>
-        <w:t xml:space="preserve">the code; that changes when you update the code. Sym/ctx identifies code by its shape, not by its</w:t>
-      </w:r>
-      <w:r>
-        <w:t xml:space="preserve"> </w:t>
-      </w:r>
-      <w:r>
-        <w:t xml:space="preserve">position. That means the reference only changes when the actual code structure changes -- not when</w:t>
-      </w:r>
-      <w:r>
-        <w:t xml:space="preserve"> </w:t>
-      </w:r>
-      <w:r>
-        <w:t xml:space="preserve">someone adds whitespace, comments, or moves unrelated code above it.</w:t>
-      </w:r>
-    </w:p>
-    <w:bookmarkEnd w:id="29"/>
+        <w:t xml:space="preserve">The Open Worldwide Application Security Project's Application Security Verification Standard</w:t>
+      </w:r>
+      <w:r>
+        <w:t xml:space="preserve"> </w:t>
+      </w:r>
+      <w:r>
+        <w:t xml:space="preserve">(ASVS) 5 defines security requirements at three levels. Choose the level that fits what your application handles.</w:t>
+      </w:r>
+    </w:p>
+    <w:p>
+      <w:pPr>
+        <w:pStyle w:val="BodyText"/>
+      </w:pPr>
+      <w:r>
+        <w:t xml:space="preserve">Ask Claude to keep a register of ASVS scores against the exact ASVS 5 wording. Summaries from</w:t>
+      </w:r>
+      <w:r>
+        <w:t xml:space="preserve"> </w:t>
+      </w:r>
+      <w:r>
+        <w:t xml:space="preserve">Claude or another source can change what a requirement asks for.</w:t>
+      </w:r>
+    </w:p>
+    <w:p>
+      <w:pPr>
+        <w:pStyle w:val="BodyText"/>
+      </w:pPr>
+      <w:r>
+        <w:t xml:space="preserve">Use</w:t>
+      </w:r>
+      <w:r>
+        <w:t xml:space="preserve"> </w:t>
+      </w:r>
+      <w:r>
+        <w:rPr>
+          <w:rStyle w:val="VerbatimChar"/>
+        </w:rPr>
+        <w:t xml:space="preserve">sym/ctx</w:t>
+      </w:r>
+      <w:r>
+        <w:t xml:space="preserve"> </w:t>
+      </w:r>
+      <w:r>
+        <w:t xml:space="preserve">anchors to connect scores to code. They identify a symbol and its surrounding</w:t>
+      </w:r>
+      <w:r>
+        <w:t xml:space="preserve"> </w:t>
+      </w:r>
+      <w:r>
+        <w:t xml:space="preserve">structure, which is more stable than a line number.</w:t>
+      </w:r>
+    </w:p>
+    <w:p>
+      <w:pPr>
+        <w:pStyle w:val="BodyText"/>
+      </w:pPr>
+      <w:r>
+        <w:t xml:space="preserve">A line number shifts when someone adds whitespace, comments, or unrelated code above it. A</w:t>
+      </w:r>
+      <w:r>
+        <w:t xml:space="preserve"> </w:t>
+      </w:r>
+      <w:r>
+        <w:t xml:space="preserve">symbol-and-context reference changes when the code structure it identifies changes.</w:t>
+      </w:r>
+    </w:p>
     <w:bookmarkEnd w:id="30"/>
-    <w:bookmarkStart w:id="39" w:name="X1a76c22eabcca111b8576e9e9f91a92506a584c"/>
+    <w:bookmarkEnd w:id="31"/>
+    <w:bookmarkStart w:id="42" w:name="X1a76c22eabcca111b8576e9e9f91a92506a584c"/>
     <w:p>
       <w:pPr>
         <w:pStyle w:val="Heading2"/>
@@ -1013,14 +886,12 @@
         <w:pStyle w:val="FirstParagraph"/>
       </w:pPr>
       <w:r>
-        <w:t xml:space="preserve">Be sure Ultracode and Opus 5 are enabled for each session.</w:t>
-      </w:r>
-    </w:p>
-    <w:p>
-      <w:pPr>
-        <w:pStyle w:val="BodyText"/>
-      </w:pPr>
-      <w:hyperlink r:id="rId12">
+        <w:t xml:space="preserve">In the setup described here, each session used Ultracode and Opus 5.</w:t>
+      </w:r>
+      <w:r>
+        <w:t xml:space="preserve"> </w:t>
+      </w:r>
+      <w:hyperlink r:id="rId13">
         <w:r>
           <w:rPr>
             <w:rStyle w:val="Hyperlink"/>
@@ -1032,16 +903,10 @@
         <w:t xml:space="preserve"> </w:t>
       </w:r>
       <w:r>
-        <w:t xml:space="preserve">is the operating procedure for this section: the opening prompt</w:t>
-      </w:r>
-      <w:r>
-        <w:t xml:space="preserve"> </w:t>
-      </w:r>
-      <w:r>
-        <w:t xml:space="preserve">for each session, the daily loop, and what to do when it goes wrong.</w:t>
-      </w:r>
-    </w:p>
-    <w:bookmarkStart w:id="31" w:name="Xa94288f7ae704dec490945374c87f7abe482367"/>
+        <w:t xml:space="preserve">supplies the opening prompts, daily procedure, and recovery steps.</w:t>
+      </w:r>
+    </w:p>
+    <w:bookmarkStart w:id="32" w:name="Xa94288f7ae704dec490945374c87f7abe482367"/>
     <w:p>
       <w:pPr>
         <w:pStyle w:val="Heading3"/>
@@ -1055,29 +920,31 @@
         <w:pStyle w:val="FirstParagraph"/>
       </w:pPr>
       <w:r>
-        <w:t xml:space="preserve">The console is the only session you talk to. It reads the record, picks an item, writes a short</w:t>
-      </w:r>
-      <w:r>
-        <w:t xml:space="preserve"> </w:t>
-      </w:r>
-      <w:r>
-        <w:t xml:space="preserve">brief, and starts a builder for it. It then polls for state instead of waiting on a message. If a</w:t>
-      </w:r>
-      <w:r>
-        <w:t xml:space="preserve"> </w:t>
-      </w:r>
-      <w:r>
-        <w:t xml:space="preserve">builder hits a question its brief did not answer, the builder writes the question back to the</w:t>
-      </w:r>
-      <w:r>
-        <w:t xml:space="preserve"> </w:t>
-      </w:r>
-      <w:r>
-        <w:t xml:space="preserve">console and stops, and the console starts a fresh builder with a better brief.</w:t>
-      </w:r>
-    </w:p>
-    <w:bookmarkEnd w:id="31"/>
-    <w:bookmarkStart w:id="35" w:name="Xe3bf01049453ff15c210d2be20817c172d98756"/>
+        <w:t xml:space="preserve">The console is the session you talk to. It reads the project record, picks an item, writes a short</w:t>
+      </w:r>
+      <w:r>
+        <w:t xml:space="preserve"> </w:t>
+      </w:r>
+      <w:r>
+        <w:t xml:space="preserve">brief, and starts a builder.</w:t>
+      </w:r>
+    </w:p>
+    <w:p>
+      <w:pPr>
+        <w:pStyle w:val="BodyText"/>
+      </w:pPr>
+      <w:r>
+        <w:t xml:space="preserve">It polls for progress. If the brief leaves a question open, the builder writes that question back</w:t>
+      </w:r>
+      <w:r>
+        <w:t xml:space="preserve"> </w:t>
+      </w:r>
+      <w:r>
+        <w:t xml:space="preserve">and stops. The console then starts a fresh builder with a clearer brief.</w:t>
+      </w:r>
+    </w:p>
+    <w:bookmarkEnd w:id="32"/>
+    <w:bookmarkStart w:id="36" w:name="Xe3bf01049453ff15c210d2be20817c172d98756"/>
     <w:p>
       <w:pPr>
         <w:pStyle w:val="Heading3"/>
@@ -1091,32 +958,26 @@
         <w:pStyle w:val="FirstParagraph"/>
       </w:pPr>
       <w:r>
-        <w:t xml:space="preserve">A builder takes one brief and runs it to a pull request: the change, the commit, the push, and the</w:t>
-      </w:r>
-      <w:r>
-        <w:t xml:space="preserve"> </w:t>
-      </w:r>
-      <w:r>
-        <w:t xml:space="preserve">PR. Then its process exits. It never guesses at what the brief left open, and it never waits for an</w:t>
-      </w:r>
-      <w:r>
-        <w:t xml:space="preserve"> </w:t>
-      </w:r>
-      <w:r>
-        <w:t xml:space="preserve">answer.</w:t>
-      </w:r>
-    </w:p>
-    <w:p>
-      <w:pPr>
-        <w:pStyle w:val="BodyText"/>
-      </w:pPr>
-      <w:r>
-        <w:t xml:space="preserve">Note that Anthropic is working on</w:t>
-      </w:r>
-      <w:r>
-        <w:t xml:space="preserve"> </w:t>
-      </w:r>
-      <w:hyperlink r:id="rId32">
+        <w:t xml:space="preserve">A builder takes one brief through the change, commit, push, and pull request. Its process then</w:t>
+      </w:r>
+      <w:r>
+        <w:t xml:space="preserve"> </w:t>
+      </w:r>
+      <w:r>
+        <w:t xml:space="preserve">exits. It does not guess at missing requirements or wait for an answer.</w:t>
+      </w:r>
+    </w:p>
+    <w:p>
+      <w:pPr>
+        <w:pStyle w:val="BodyText"/>
+      </w:pPr>
+      <w:r>
+        <w:t xml:space="preserve">At the time of this account,</w:t>
+      </w:r>
+      <w:r>
+        <w:t xml:space="preserve"> </w:t>
+      </w:r>
+      <w:hyperlink r:id="rId33">
         <w:r>
           <w:rPr>
             <w:rStyle w:val="Hyperlink"/>
@@ -1125,18 +986,21 @@
         </w:r>
       </w:hyperlink>
       <w:r>
-        <w:t xml:space="preserve">,</w:t>
-      </w:r>
-      <w:r>
-        <w:t xml:space="preserve"> </w:t>
-      </w:r>
-      <w:r>
-        <w:t xml:space="preserve">which may be a significant enhancement once it is out of beta. For now, your builders will use</w:t>
-      </w:r>
-      <w:r>
-        <w:t xml:space="preserve"> </w:t>
-      </w:r>
-      <w:hyperlink r:id="rId33">
+        <w:t xml:space="preserve"> </w:t>
+      </w:r>
+      <w:r>
+        <w:t xml:space="preserve">was in beta.</w:t>
+      </w:r>
+      <w:r>
+        <w:t xml:space="preserve"> </w:t>
+      </w:r>
+      <w:r>
+        <w:t xml:space="preserve">The builders used</w:t>
+      </w:r>
+      <w:r>
+        <w:t xml:space="preserve"> </w:t>
+      </w:r>
+      <w:hyperlink r:id="rId34">
         <w:r>
           <w:rPr>
             <w:rStyle w:val="Hyperlink"/>
@@ -1145,25 +1009,31 @@
         </w:r>
       </w:hyperlink>
       <w:r>
-        <w:t xml:space="preserve">. See</w:t>
-      </w:r>
-      <w:r>
-        <w:t xml:space="preserve"> </w:t>
-      </w:r>
-      <w:hyperlink r:id="rId34">
+        <w:t xml:space="preserve">.</w:t>
+      </w:r>
+      <w:r>
+        <w:t xml:space="preserve"> </w:t>
+      </w:r>
+      <w:r>
+        <w:t xml:space="preserve">See also</w:t>
+      </w:r>
+      <w:r>
+        <w:t xml:space="preserve"> </w:t>
+      </w:r>
+      <w:hyperlink r:id="rId35">
         <w:r>
           <w:rPr>
             <w:rStyle w:val="Hyperlink"/>
           </w:rPr>
-          <w:t xml:space="preserve">Run agents in parallel - Claude Code Docs</w:t>
+          <w:t xml:space="preserve">Run agents in parallel</w:t>
         </w:r>
       </w:hyperlink>
       <w:r>
         <w:t xml:space="preserve">.</w:t>
       </w:r>
     </w:p>
-    <w:bookmarkEnd w:id="35"/>
-    <w:bookmarkStart w:id="36" w:name="X01dbd2a17b58d17af4e4408d9b17f20f3863f4f"/>
+    <w:bookmarkEnd w:id="36"/>
+    <w:bookmarkStart w:id="38" w:name="X01dbd2a17b58d17af4e4408d9b17f20f3863f4f"/>
     <w:p>
       <w:pPr>
         <w:pStyle w:val="Heading3"/>
@@ -1177,189 +1047,248 @@
         <w:pStyle w:val="FirstParagraph"/>
       </w:pPr>
       <w:r>
-        <w:t xml:space="preserve">Lander decides what enters the merge queue and in what order, and it merge-forwards. It should have</w:t>
-      </w:r>
-      <w:r>
-        <w:t xml:space="preserve"> </w:t>
-      </w:r>
-      <w:r>
-        <w:t xml:space="preserve">authority to handle these independently. This is needed because multisession coding creates merge</w:t>
-      </w:r>
-      <w:r>
-        <w:t xml:space="preserve"> </w:t>
-      </w:r>
-      <w:r>
-        <w:t xml:space="preserve">conflicts when the repo's head is constantly changing. This is especially true with larger</w:t>
-      </w:r>
-      <w:r>
-        <w:t xml:space="preserve"> </w:t>
-      </w:r>
-      <w:r>
-        <w:t xml:space="preserve">codebases, which created extended CI times. It will not merge a pull request that no reviewer has</w:t>
-      </w:r>
-      <w:r>
-        <w:t xml:space="preserve"> </w:t>
-      </w:r>
-      <w:r>
-        <w:t xml:space="preserve">labelled.</w:t>
-      </w:r>
-    </w:p>
-    <w:bookmarkEnd w:id="36"/>
-    <w:bookmarkStart w:id="37" w:name="X88dbc1b726c4228ef8af1f19f170eee122c831c"/>
-    <w:p>
-      <w:pPr>
-        <w:pStyle w:val="Heading3"/>
-      </w:pPr>
-      <w:r>
-        <w:t xml:space="preserve">6.4 Reviewer session</w:t>
-      </w:r>
-    </w:p>
-    <w:p>
-      <w:pPr>
-        <w:pStyle w:val="FirstParagraph"/>
-      </w:pPr>
-      <w:r>
-        <w:t xml:space="preserve">This section used to describe an ASVS monitor session, which was retired on 2026-09-01.</w:t>
-      </w:r>
-    </w:p>
-    <w:p>
-      <w:pPr>
-        <w:pStyle w:val="BodyText"/>
-      </w:pPr>
-      <w:r>
-        <w:t xml:space="preserve">Start a reviewer for each pull request. It reads the diff. On a pass it applies the reviewed label</w:t>
-      </w:r>
-      <w:r>
-        <w:t xml:space="preserve"> </w:t>
-      </w:r>
-      <w:r>
-        <w:t xml:space="preserve">and posts the head SHA it read, so you can tell which version was actually looked at. On a fail it</w:t>
-      </w:r>
-      <w:r>
-        <w:t xml:space="preserve"> </w:t>
-      </w:r>
-      <w:r>
-        <w:t xml:space="preserve">posts the findings on the pull request, for whichever builder comes next. A reviewer never merges.</w:t>
-      </w:r>
-    </w:p>
-    <w:bookmarkEnd w:id="37"/>
-    <w:bookmarkStart w:id="38" w:name="Xff877a136a022849bae3f06d835c670cea10db0"/>
-    <w:p>
-      <w:pPr>
-        <w:pStyle w:val="Heading3"/>
-      </w:pPr>
-      <w:r>
-        <w:t xml:space="preserve">6.5 Regulator session</w:t>
-      </w:r>
-    </w:p>
-    <w:p>
-      <w:pPr>
-        <w:pStyle w:val="FirstParagraph"/>
-      </w:pPr>
-      <w:r>
-        <w:t xml:space="preserve">Start a regulator when a required check goes red. Its job is deciding whose failure it is: the</w:t>
-      </w:r>
-      <w:r>
-        <w:t xml:space="preserve"> </w:t>
-      </w:r>
-      <w:r>
-        <w:t xml:space="preserve">pull request's, the trunk's, a flake's, or the queue's. Only the first is a builder's to fix.</w:t>
-      </w:r>
-      <w:r>
-        <w:t xml:space="preserve"> </w:t>
-      </w:r>
-      <w:r>
-        <w:t xml:space="preserve">Sending the other three back is the mistake it prevents. It has no memory of earlier reds, so</w:t>
-      </w:r>
-      <w:r>
-        <w:t xml:space="preserve"> </w:t>
-      </w:r>
-      <w:r>
-        <w:t xml:space="preserve">it keeps a log.</w:t>
-      </w:r>
-    </w:p>
-    <w:p>
-      <w:pPr>
-        <w:pStyle w:val="BodyText"/>
-      </w:pPr>
-      <w:r>
-        <w:rPr>
-          <w:b/>
-          <w:bCs/>
-        </w:rPr>
-        <w:t xml:space="preserve">A steward is not on this list, because it is not a session.</w:t>
-      </w:r>
-      <w:r>
-        <w:t xml:space="preserve"> </w:t>
-      </w:r>
-      <w:r>
-        <w:t xml:space="preserve">It is a cron with no model calls.</w:t>
-      </w:r>
-      <w:r>
-        <w:t xml:space="preserve"> </w:t>
-      </w:r>
-      <w:r>
-        <w:t xml:space="preserve">It reads account usage and names the account with headroom, and it cannot interrupt a session</w:t>
-      </w:r>
-      <w:r>
-        <w:t xml:space="preserve"> </w:t>
-      </w:r>
-      <w:r>
-        <w:t xml:space="preserve">that is already running.</w:t>
-      </w:r>
-    </w:p>
-    <w:bookmarkEnd w:id="38"/>
-    <w:bookmarkEnd w:id="39"/>
-    <w:bookmarkStart w:id="42" w:name="Xfc881a61c1b7e5edb382f7c2ee75f5a253033e1"/>
-    <w:p>
-      <w:pPr>
-        <w:pStyle w:val="Heading2"/>
-      </w:pPr>
-      <w:r>
-        <w:t xml:space="preserve">7. Worktrees</w:t>
-      </w:r>
-    </w:p>
-    <w:p>
-      <w:pPr>
-        <w:pStyle w:val="FirstParagraph"/>
-      </w:pPr>
-      <w:r>
-        <w:t xml:space="preserve">Worktrees deconflict workflows sharing a repo. See</w:t>
-      </w:r>
-      <w:r>
-        <w:t xml:space="preserve"> </w:t>
-      </w:r>
-      <w:hyperlink r:id="rId40">
+        <w:t xml:space="preserve">The lander chooses which changes enter the merge queue and in what order. With authority from the</w:t>
+      </w:r>
+      <w:r>
+        <w:t xml:space="preserve"> </w:t>
+      </w:r>
+      <w:r>
+        <w:t xml:space="preserve">owner, it also merges newer trunk changes into branches that need them.</w:t>
+      </w:r>
+    </w:p>
+    <w:p>
+      <w:pPr>
+        <w:pStyle w:val="BodyText"/>
+      </w:pPr>
+      <w:r>
+        <w:t xml:space="preserve">This matters when concurrent work keeps moving the repository's head, especially when large</w:t>
+      </w:r>
+      <w:r>
+        <w:t xml:space="preserve"> </w:t>
+      </w:r>
+      <w:r>
+        <w:t xml:space="preserve">codebases take longer to test.</w:t>
+      </w:r>
+    </w:p>
+    <w:p>
+      <w:pPr>
+        <w:pStyle w:val="BodyText"/>
+      </w:pPr>
+      <w:r>
+        <w:t xml:space="preserve">The original account required a reviewer label before merging. That rule was retired on</w:t>
+      </w:r>
+      <w:r>
+        <w:t xml:space="preserve"> </w:t>
+      </w:r>
+      <w:r>
+        <w:t xml:space="preserve">2026-09-04; use the current</w:t>
+      </w:r>
+      <w:r>
+        <w:t xml:space="preserve"> </w:t>
+      </w:r>
+      <w:hyperlink r:id="rId37">
         <w:r>
           <w:rPr>
             <w:rStyle w:val="Hyperlink"/>
           </w:rPr>
-          <w:t xml:space="preserve">Worktrees - claude-multisession</w:t>
+          <w:t xml:space="preserve">Lander card</w:t>
         </w:r>
       </w:hyperlink>
       <w:r>
         <w:t xml:space="preserve"> </w:t>
       </w:r>
       <w:r>
-        <w:t xml:space="preserve">and</w:t>
-      </w:r>
-      <w:r>
-        <w:t xml:space="preserve"> </w:t>
-      </w:r>
-      <w:hyperlink r:id="rId41">
+        <w:t xml:space="preserve">and repository checks for today's requirement.</w:t>
+      </w:r>
+    </w:p>
+    <w:bookmarkEnd w:id="38"/>
+    <w:bookmarkStart w:id="40" w:name="X88dbc1b726c4228ef8af1f19f170eee122c831c"/>
+    <w:p>
+      <w:pPr>
+        <w:pStyle w:val="Heading3"/>
+      </w:pPr>
+      <w:r>
+        <w:t xml:space="preserve">6.4 Reviewer session</w:t>
+      </w:r>
+    </w:p>
+    <w:p>
+      <w:pPr>
+        <w:pStyle w:val="FirstParagraph"/>
+      </w:pPr>
+      <w:r>
+        <w:t xml:space="preserve">This section once described an ASVS monitor, a role retired on 2026-09-01.</w:t>
+      </w:r>
+    </w:p>
+    <w:p>
+      <w:pPr>
+        <w:pStyle w:val="BodyText"/>
+      </w:pPr>
+      <w:r>
+        <w:t xml:space="preserve">Start a reviewer for each pull request. It reads the diff and records the exact head commit it</w:t>
+      </w:r>
+      <w:r>
+        <w:t xml:space="preserve"> </w:t>
+      </w:r>
+      <w:r>
+        <w:t xml:space="preserve">examined. Findings go on the pull request for the next builder; the reviewer never merges.</w:t>
+      </w:r>
+    </w:p>
+    <w:p>
+      <w:pPr>
+        <w:pStyle w:val="BodyText"/>
+      </w:pPr>
+      <w:r>
+        <w:t xml:space="preserve">The original procedure also applied a</w:t>
+      </w:r>
+      <w:r>
+        <w:t xml:space="preserve"> </w:t>
+      </w:r>
+      <w:r>
+        <w:rPr>
+          <w:rStyle w:val="VerbatimChar"/>
+        </w:rPr>
+        <w:t xml:space="preserve">reviewed</w:t>
+      </w:r>
+      <w:r>
+        <w:t xml:space="preserve"> </w:t>
+      </w:r>
+      <w:r>
+        <w:t xml:space="preserve">label on a pass. The label-based merge gate was</w:t>
+      </w:r>
+      <w:r>
+        <w:t xml:space="preserve"> </w:t>
+      </w:r>
+      <w:r>
+        <w:t xml:space="preserve">retired on 2026-09-04, as the current</w:t>
+      </w:r>
+      <w:r>
+        <w:t xml:space="preserve"> </w:t>
+      </w:r>
+      <w:hyperlink r:id="rId39">
         <w:r>
           <w:rPr>
             <w:rStyle w:val="Hyperlink"/>
           </w:rPr>
-          <w:t xml:space="preserve">Run parallel sessions with worktrees - Claude Code Docs</w:t>
+          <w:t xml:space="preserve">Reviewer card</w:t>
         </w:r>
       </w:hyperlink>
       <w:r>
+        <w:t xml:space="preserve"> </w:t>
+      </w:r>
+      <w:r>
+        <w:t xml:space="preserve">records.</w:t>
+      </w:r>
+    </w:p>
+    <w:bookmarkEnd w:id="40"/>
+    <w:bookmarkStart w:id="41" w:name="Xff877a136a022849bae3f06d835c670cea10db0"/>
+    <w:p>
+      <w:pPr>
+        <w:pStyle w:val="Heading3"/>
+      </w:pPr>
+      <w:r>
+        <w:t xml:space="preserve">6.5 Regulator session</w:t>
+      </w:r>
+    </w:p>
+    <w:p>
+      <w:pPr>
+        <w:pStyle w:val="FirstParagraph"/>
+      </w:pPr>
+      <w:r>
+        <w:t xml:space="preserve">Start a regulator when a required check fails. It determines whether the cause belongs to the</w:t>
+      </w:r>
+      <w:r>
+        <w:t xml:space="preserve"> </w:t>
+      </w:r>
+      <w:r>
+        <w:t xml:space="preserve">pull request, trunk, an intermittent test failure, or the queue.</w:t>
+      </w:r>
+    </w:p>
+    <w:p>
+      <w:pPr>
+        <w:pStyle w:val="BodyText"/>
+      </w:pPr>
+      <w:r>
+        <w:t xml:space="preserve">Only a failure caused by the pull request goes back to its builder. The regulator keeps a log</w:t>
+      </w:r>
+      <w:r>
+        <w:t xml:space="preserve"> </w:t>
+      </w:r>
+      <w:r>
+        <w:t xml:space="preserve">because it does not retain memory of earlier failed runs.</w:t>
+      </w:r>
+    </w:p>
+    <w:p>
+      <w:pPr>
+        <w:pStyle w:val="BodyText"/>
+      </w:pPr>
+      <w:r>
+        <w:t xml:space="preserve">The steward is a scheduled script, not an AI session. It reads account usage and identifies an</w:t>
+      </w:r>
+      <w:r>
+        <w:t xml:space="preserve"> </w:t>
+      </w:r>
+      <w:r>
+        <w:t xml:space="preserve">account with room left. It makes no model calls and cannot interrupt a running session.</w:t>
+      </w:r>
+    </w:p>
+    <w:bookmarkEnd w:id="41"/>
+    <w:bookmarkEnd w:id="42"/>
+    <w:bookmarkStart w:id="45" w:name="Xfc881a61c1b7e5edb382f7c2ee75f5a253033e1"/>
+    <w:p>
+      <w:pPr>
+        <w:pStyle w:val="Heading2"/>
+      </w:pPr>
+      <w:r>
+        <w:t xml:space="preserve">7. Worktrees</w:t>
+      </w:r>
+    </w:p>
+    <w:p>
+      <w:pPr>
+        <w:pStyle w:val="FirstParagraph"/>
+      </w:pPr>
+      <w:r>
+        <w:t xml:space="preserve">Give each session its own worktree so it can edit files without changing another session's</w:t>
+      </w:r>
+      <w:r>
+        <w:t xml:space="preserve"> </w:t>
+      </w:r>
+      <w:r>
+        <w:t xml:space="preserve">checkout. Read</w:t>
+      </w:r>
+      <w:r>
+        <w:t xml:space="preserve"> </w:t>
+      </w:r>
+      <w:hyperlink r:id="rId43">
+        <w:r>
+          <w:rPr>
+            <w:rStyle w:val="Hyperlink"/>
+          </w:rPr>
+          <w:t xml:space="preserve">Worktrees</w:t>
+        </w:r>
+      </w:hyperlink>
+      <w:r>
+        <w:t xml:space="preserve"> </w:t>
+      </w:r>
+      <w:r>
+        <w:t xml:space="preserve">and</w:t>
+      </w:r>
+      <w:r>
+        <w:t xml:space="preserve"> </w:t>
+      </w:r>
+      <w:hyperlink r:id="rId44">
+        <w:r>
+          <w:rPr>
+            <w:rStyle w:val="Hyperlink"/>
+          </w:rPr>
+          <w:t xml:space="preserve">Claude Code's worktree guide</w:t>
+        </w:r>
+      </w:hyperlink>
+      <w:r>
         <w:t xml:space="preserve">.</w:t>
       </w:r>
     </w:p>
-    <w:bookmarkEnd w:id="42"/>
-    <w:bookmarkStart w:id="45" w:name="X515c0360240f6cf4d0e8b129bb6b9d1475316e9"/>
+    <w:bookmarkEnd w:id="45"/>
+    <w:bookmarkStart w:id="48" w:name="X515c0360240f6cf4d0e8b129bb6b9d1475316e9"/>
     <w:p>
       <w:pPr>
         <w:pStyle w:val="Heading2"/>
@@ -1373,26 +1302,18 @@
         <w:pStyle w:val="FirstParagraph"/>
       </w:pPr>
       <w:r>
-        <w:t xml:space="preserve">Claude Code sessions can be configured to speak with each other. The method differs between sessions</w:t>
-      </w:r>
-      <w:r>
-        <w:t xml:space="preserve"> </w:t>
-      </w:r>
-      <w:r>
-        <w:t xml:space="preserve">inside of the desktop app and those in the VS Code extension.</w:t>
-      </w:r>
-    </w:p>
-    <w:p>
-      <w:pPr>
-        <w:pStyle w:val="BodyText"/>
-      </w:pPr>
-      <w:r>
-        <w:t xml:space="preserve">Combined with the coordination methods listed in</w:t>
-      </w:r>
-      <w:r>
-        <w:t xml:space="preserve"> </w:t>
-      </w:r>
-      <w:hyperlink r:id="rId43">
+        <w:t xml:space="preserve">Sessions can exchange messages, but the available channels differ between the desktop app and</w:t>
+      </w:r>
+      <w:r>
+        <w:t xml:space="preserve"> </w:t>
+      </w:r>
+      <w:r>
+        <w:t xml:space="preserve">the VS Code extension.</w:t>
+      </w:r>
+      <w:r>
+        <w:t xml:space="preserve"> </w:t>
+      </w:r>
+      <w:hyperlink r:id="rId46">
         <w:r>
           <w:rPr>
             <w:rStyle w:val="Hyperlink"/>
@@ -1401,34 +1322,42 @@
         </w:r>
       </w:hyperlink>
       <w:r>
-        <w:t xml:space="preserve">, the sessions can build your</w:t>
-      </w:r>
-      <w:r>
-        <w:t xml:space="preserve"> </w:t>
-      </w:r>
-      <w:r>
-        <w:t xml:space="preserve">project without conflict -- mostly. When there is a conflict, a builder writes the problem to the</w:t>
-      </w:r>
-      <w:r>
-        <w:t xml:space="preserve"> </w:t>
-      </w:r>
-      <w:r>
-        <w:t xml:space="preserve">console rather than guessing, and the console decides what happens next. Also see</w:t>
-      </w:r>
-      <w:r>
-        <w:t xml:space="preserve"> </w:t>
-      </w:r>
-      <w:hyperlink r:id="rId44">
+        <w:t xml:space="preserve"> </w:t>
+      </w:r>
+      <w:r>
+        <w:t xml:space="preserve">describes the checks around their shared work.</w:t>
+      </w:r>
+    </w:p>
+    <w:p>
+      <w:pPr>
+        <w:pStyle w:val="BodyText"/>
+      </w:pPr>
+      <w:r>
+        <w:t xml:space="preserve">Conflicts still happen. A builder reports an unresolved problem to the console, which decides</w:t>
+      </w:r>
+      <w:r>
+        <w:t xml:space="preserve"> </w:t>
+      </w:r>
+      <w:r>
+        <w:t xml:space="preserve">what to do next. See</w:t>
+      </w:r>
+      <w:r>
+        <w:t xml:space="preserve"> </w:t>
+      </w:r>
+      <w:hyperlink r:id="rId47">
         <w:r>
           <w:rPr>
             <w:rStyle w:val="Hyperlink"/>
           </w:rPr>
-          <w:t xml:space="preserve">Message your other Claude Code sessions - Claude Code Docs</w:t>
+          <w:t xml:space="preserve">Claude Code's cross-session messaging guide</w:t>
         </w:r>
       </w:hyperlink>
-    </w:p>
-    <w:bookmarkEnd w:id="45"/>
-    <w:bookmarkStart w:id="47" w:name="X59739ce650e297ae022c956a66a1ad695ac4192"/>
+      <w:r>
+        <w:t xml:space="preserve">.</w:t>
+      </w:r>
+    </w:p>
+    <w:bookmarkEnd w:id="48"/>
+    <w:bookmarkStart w:id="50" w:name="X59739ce650e297ae022c956a66a1ad695ac4192"/>
     <w:p>
       <w:pPr>
         <w:pStyle w:val="Heading2"/>
@@ -1442,28 +1371,31 @@
         <w:pStyle w:val="FirstParagraph"/>
       </w:pPr>
       <w:r>
-        <w:t xml:space="preserve">Anthropic has rejected enhancement requests asking to make Claude Code usage-limit aware. So, Claude</w:t>
-      </w:r>
-      <w:r>
-        <w:t xml:space="preserve"> </w:t>
-      </w:r>
-      <w:r>
-        <w:t xml:space="preserve">and I built one:</w:t>
-      </w:r>
-      <w:r>
-        <w:t xml:space="preserve"> </w:t>
-      </w:r>
-      <w:hyperlink r:id="rId46">
+        <w:t xml:space="preserve">After Anthropic rejected requests to make Claude Code aware of usage limits, I worked with Claude</w:t>
+      </w:r>
+      <w:r>
+        <w:t xml:space="preserve"> </w:t>
+      </w:r>
+      <w:r>
+        <w:t xml:space="preserve">on</w:t>
+      </w:r>
+      <w:r>
+        <w:t xml:space="preserve"> </w:t>
+      </w:r>
+      <w:hyperlink r:id="rId49">
         <w:r>
           <w:rPr>
             <w:rStyle w:val="Hyperlink"/>
           </w:rPr>
-          <w:t xml:space="preserve">Usage awareness: knowing when to stop.</w:t>
+          <w:t xml:space="preserve">usage awareness</w:t>
         </w:r>
       </w:hyperlink>
-    </w:p>
-    <w:bookmarkEnd w:id="47"/>
-    <w:bookmarkStart w:id="49" w:name="X4e68ad135e57c05e0c49f806ccb0c45722a1de8"/>
+      <w:r>
+        <w:t xml:space="preserve">. That page describes the design and what it does and does not ship.</w:t>
+      </w:r>
+    </w:p>
+    <w:bookmarkEnd w:id="50"/>
+    <w:bookmarkStart w:id="52" w:name="X4e68ad135e57c05e0c49f806ccb0c45722a1de8"/>
     <w:p>
       <w:pPr>
         <w:pStyle w:val="Heading2"/>
@@ -1477,31 +1409,36 @@
         <w:pStyle w:val="FirstParagraph"/>
       </w:pPr>
       <w:r>
-        <w:t xml:space="preserve">CI using GitHub Actions automates enforcement of your quality standards and prevents bugs from</w:t>
-      </w:r>
-      <w:r>
-        <w:t xml:space="preserve"> </w:t>
-      </w:r>
-      <w:r>
-        <w:t xml:space="preserve">reaching the repo. See</w:t>
-      </w:r>
-      <w:r>
-        <w:t xml:space="preserve"> </w:t>
-      </w:r>
-      <w:hyperlink r:id="rId48">
+        <w:t xml:space="preserve">Continuous integration runs automated checks when code changes. With GitHub Actions and required</w:t>
+      </w:r>
+      <w:r>
+        <w:t xml:space="preserve"> </w:t>
+      </w:r>
+      <w:r>
+        <w:t xml:space="preserve">checks, you can block changes that fail your project's standards.</w:t>
+      </w:r>
+    </w:p>
+    <w:p>
+      <w:pPr>
+        <w:pStyle w:val="BodyText"/>
+      </w:pPr>
+      <w:hyperlink r:id="rId51">
         <w:r>
           <w:rPr>
             <w:rStyle w:val="Hyperlink"/>
           </w:rPr>
-          <w:t xml:space="preserve">this CI introduction</w:t>
+          <w:t xml:space="preserve">CI for leaders</w:t>
         </w:r>
       </w:hyperlink>
       <w:r>
-        <w:t xml:space="preserve">.</w:t>
-      </w:r>
-    </w:p>
-    <w:bookmarkEnd w:id="49"/>
-    <w:bookmarkEnd w:id="50"/>
+        <w:t xml:space="preserve"> </w:t>
+      </w:r>
+      <w:r>
+        <w:t xml:space="preserve">explains how to choose checks and what their results establish.</w:t>
+      </w:r>
+    </w:p>
+    <w:bookmarkEnd w:id="52"/>
+    <w:bookmarkEnd w:id="53"/>
     <w:sectPr>
       <w:footnotePr>
         <w:numRestart w:val="eachSect"/>
@@ -1612,123 +1549,114 @@
       </w:pPr>
     </w:lvl>
   </w:abstractNum>
-  <w:abstractNum w:abstractNumId="99411">
-    <w:nsid w:val="00A99411"/>
+  <w:abstractNum w:abstractNumId="991">
+    <w:nsid w:val="0000A991"/>
     <w:multiLevelType w:val="multilevel"/>
     <w:lvl w:ilvl="0">
-      <w:start w:val="1"/>
-      <w:numFmt w:val="decimal"/>
-      <w:lvlText w:val="%1."/>
+      <w:numFmt w:val="bullet"/>
+      <w:lvlText w:val=""/>
       <w:lvlJc w:val="left"/>
       <w:pPr>
         <w:ind w:left="720" w:hanging="360"/>
       </w:pPr>
+      <w:rPr>
+        <w:rFonts w:ascii="Symbol" w:hAnsi="Symbol" w:cs="Symbol" w:hint="default"/>
+      </w:rPr>
     </w:lvl>
     <w:lvl w:ilvl="1">
-      <w:start w:val="1"/>
-      <w:numFmt w:val="decimal"/>
-      <w:lvlText w:val="%2."/>
+      <w:numFmt w:val="bullet"/>
+      <w:lvlText w:val="o"/>
       <w:lvlJc w:val="left"/>
       <w:pPr>
         <w:ind w:left="1440" w:hanging="360"/>
       </w:pPr>
+      <w:rPr>
+        <w:rFonts w:ascii="Courier New" w:hAnsi="Courier New" w:cs="Courier New" w:hint="default"/>
+      </w:rPr>
     </w:lvl>
     <w:lvl w:ilvl="2">
-      <w:start w:val="1"/>
-      <w:numFmt w:val="decimal"/>
-      <w:lvlText w:val="%3."/>
+      <w:numFmt w:val="bullet"/>
+      <w:lvlText w:val=""/>
       <w:lvlJc w:val="left"/>
       <w:pPr>
         <w:ind w:left="2160" w:hanging="360"/>
       </w:pPr>
+      <w:rPr>
+        <w:rFonts w:ascii="Wingdings" w:hAnsi="Wingdings" w:cs="Wingdings" w:hint="default"/>
+      </w:rPr>
     </w:lvl>
     <w:lvl w:ilvl="3">
-      <w:start w:val="1"/>
-      <w:numFmt w:val="decimal"/>
-      <w:lvlText w:val="%4."/>
+      <w:numFmt w:val="bullet"/>
+      <w:lvlText w:val=""/>
       <w:lvlJc w:val="left"/>
       <w:pPr>
         <w:ind w:left="2880" w:hanging="360"/>
       </w:pPr>
+      <w:rPr>
+        <w:rFonts w:ascii="Symbol" w:hAnsi="Symbol" w:cs="Symbol" w:hint="default"/>
+      </w:rPr>
     </w:lvl>
     <w:lvl w:ilvl="4">
-      <w:start w:val="1"/>
-      <w:numFmt w:val="decimal"/>
-      <w:lvlText w:val="%5."/>
+      <w:numFmt w:val="bullet"/>
+      <w:lvlText w:val="o"/>
       <w:lvlJc w:val="left"/>
       <w:pPr>
         <w:ind w:left="3600" w:hanging="360"/>
       </w:pPr>
+      <w:rPr>
+        <w:rFonts w:ascii="Courier New" w:hAnsi="Courier New" w:cs="Courier New" w:hint="default"/>
+      </w:rPr>
     </w:lvl>
     <w:lvl w:ilvl="5">
-      <w:start w:val="1"/>
-      <w:numFmt w:val="decimal"/>
-      <w:lvlText w:val="%6."/>
+      <w:numFmt w:val="bullet"/>
+      <w:lvlText w:val=""/>
       <w:lvlJc w:val="left"/>
       <w:pPr>
         <w:ind w:left="4320" w:hanging="360"/>
       </w:pPr>
+      <w:rPr>
+        <w:rFonts w:ascii="Wingdings" w:hAnsi="Wingdings" w:cs="Wingdings" w:hint="default"/>
+      </w:rPr>
     </w:lvl>
     <w:lvl w:ilvl="6">
-      <w:start w:val="1"/>
-      <w:numFmt w:val="decimal"/>
-      <w:lvlText w:val="%7."/>
+      <w:numFmt w:val="bullet"/>
+      <w:lvlText w:val=""/>
       <w:lvlJc w:val="left"/>
       <w:pPr>
         <w:ind w:left="5040" w:hanging="360"/>
       </w:pPr>
+      <w:rPr>
+        <w:rFonts w:ascii="Symbol" w:hAnsi="Symbol" w:cs="Symbol" w:hint="default"/>
+      </w:rPr>
     </w:lvl>
     <w:lvl w:ilvl="7">
-      <w:start w:val="1"/>
-      <w:numFmt w:val="decimal"/>
-      <w:lvlText w:val="%8."/>
+      <w:numFmt w:val="bullet"/>
+      <w:lvlText w:val="o"/>
       <w:lvlJc w:val="left"/>
       <w:pPr>
         <w:ind w:left="5760" w:hanging="360"/>
       </w:pPr>
+      <w:rPr>
+        <w:rFonts w:ascii="Courier New" w:hAnsi="Courier New" w:cs="Courier New" w:hint="default"/>
+      </w:rPr>
     </w:lvl>
     <w:lvl w:ilvl="8">
-      <w:start w:val="1"/>
-      <w:numFmt w:val="decimal"/>
-      <w:lvlText w:val="%9."/>
+      <w:numFmt w:val="bullet"/>
+      <w:lvlText w:val=""/>
       <w:lvlJc w:val="left"/>
       <w:pPr>
         <w:ind w:left="6480" w:hanging="360"/>
       </w:pPr>
+      <w:rPr>
+        <w:rFonts w:ascii="Wingdings" w:hAnsi="Wingdings" w:cs="Wingdings" w:hint="default"/>
+      </w:rPr>
     </w:lvl>
   </w:abstractNum>
   <w:num w:numId="1000">
     <w:abstractNumId w:val="990"/>
   </w:num>
   <w:num w:numId="1001">
-    <w:abstractNumId w:val="99411"/>
-    <w:lvlOverride w:ilvl="0">
-      <w:startOverride w:val="1"/>
-    </w:lvlOverride>
-    <w:lvlOverride w:ilvl="1">
-      <w:startOverride w:val="1"/>
-    </w:lvlOverride>
-    <w:lvlOverride w:ilvl="2">
-      <w:startOverride w:val="1"/>
-    </w:lvlOverride>
-    <w:lvlOverride w:ilvl="3">
-      <w:startOverride w:val="1"/>
-    </w:lvlOverride>
-    <w:lvlOverride w:ilvl="4">
-      <w:startOverride w:val="1"/>
-    </w:lvlOverride>
-    <w:lvlOverride w:ilvl="5">
-      <w:startOverride w:val="1"/>
-    </w:lvlOverride>
-    <w:lvlOverride w:ilvl="6">
-      <w:startOverride w:val="1"/>
-    </w:lvlOverride>
-    <w:lvlOverride w:ilvl="7">
-      <w:startOverride w:val="1"/>
-    </w:lvlOverride>
-    <w:lvlOverride w:ilvl="8">
-      <w:startOverride w:val="1"/>
-    </w:lvlOverride>
+    <w:abstractNumId w:val="991"/>
   </w:num>
 </w:numbering>
 </file>

</xml_diff>

<commit_message>
docs: replace console build model with manager subagents
</commit_message>
<xml_diff>
--- a/docs/word/KORUS.docx
+++ b/docs/word/KORUS.docx
@@ -268,7 +268,7 @@
         </w:numPr>
       </w:pPr>
       <w:r>
-        <w:t xml:space="preserve">A console to write briefs, a builder per brief, and a lander to manage the merge queue.</w:t>
+        <w:t xml:space="preserve">A manager running one or more builder subagents, with a lander handling the merge queue.</w:t>
       </w:r>
     </w:p>
     <w:p>
@@ -690,7 +690,7 @@
         <w:pStyle w:val="FirstParagraph"/>
       </w:pPr>
       <w:r>
-        <w:t xml:space="preserve">Ask Claude Code to create a project backlog and add new work as it comes up. Have the console use</w:t>
+        <w:t xml:space="preserve">Ask Claude Code to create a project backlog and add new work as it comes up. Have the manager use</w:t>
       </w:r>
       <w:r>
         <w:t xml:space="preserve"> </w:t>
@@ -729,7 +729,7 @@
         <w:t xml:space="preserve"> </w:t>
       </w:r>
       <w:r>
-        <w:t xml:space="preserve">requirement when you ask the console to make a plan.</w:t>
+        <w:t xml:space="preserve">requirement when you ask the manager to make a plan.</w:t>
       </w:r>
     </w:p>
     <w:p>
@@ -906,13 +906,13 @@
         <w:t xml:space="preserve">supplies the opening prompts, daily procedure, and recovery steps.</w:t>
       </w:r>
     </w:p>
-    <w:bookmarkStart w:id="32" w:name="Xa94288f7ae704dec490945374c87f7abe482367"/>
+    <w:bookmarkStart w:id="32" w:name="X4e7f8702c13f498de33df0b1ed8f3aa2b1af9f5"/>
     <w:p>
       <w:pPr>
         <w:pStyle w:val="Heading3"/>
       </w:pPr>
       <w:r>
-        <w:t xml:space="preserve">6.1 Console session</w:t>
+        <w:t xml:space="preserve">6.1 Manager session</w:t>
       </w:r>
     </w:p>
     <w:p>
@@ -920,27 +920,31 @@
         <w:pStyle w:val="FirstParagraph"/>
       </w:pPr>
       <w:r>
-        <w:t xml:space="preserve">The console is the session you talk to. It reads the project record, picks an item, writes a short</w:t>
-      </w:r>
-      <w:r>
-        <w:t xml:space="preserve"> </w:t>
-      </w:r>
-      <w:r>
-        <w:t xml:space="preserve">brief, and starts a builder.</w:t>
-      </w:r>
-    </w:p>
-    <w:p>
-      <w:pPr>
-        <w:pStyle w:val="BodyText"/>
-      </w:pPr>
-      <w:r>
-        <w:t xml:space="preserve">It polls for progress. If the brief leaves a question open, the builder writes that question back</w:t>
-      </w:r>
-      <w:r>
-        <w:t xml:space="preserve"> </w:t>
-      </w:r>
-      <w:r>
-        <w:t xml:space="preserve">and stops. The console then starts a fresh builder with a clearer brief.</w:t>
+        <w:t xml:space="preserve">The console was meant to oversee many parts of the build. It did not work, and the manager replaced it.</w:t>
+      </w:r>
+    </w:p>
+    <w:p>
+      <w:pPr>
+        <w:pStyle w:val="BodyText"/>
+      </w:pPr>
+      <w:r>
+        <w:t xml:space="preserve">The manager is the session you talk to. It reads the project record and runs one or more builders as subagents.</w:t>
+      </w:r>
+    </w:p>
+    <w:p>
+      <w:pPr>
+        <w:pStyle w:val="BodyText"/>
+      </w:pPr>
+      <w:r>
+        <w:t xml:space="preserve">Each builder gets a brief and its own worktree. The manager reads the results and resolves missing requirements before assigning more work.</w:t>
+      </w:r>
+    </w:p>
+    <w:p>
+      <w:pPr>
+        <w:pStyle w:val="BodyText"/>
+      </w:pPr>
+      <w:r>
+        <w:t xml:space="preserve">A manager and its builders use one account. Several managers may share the repository, so their assigned paths must not conflict.</w:t>
       </w:r>
     </w:p>
     <w:bookmarkEnd w:id="32"/>
@@ -958,13 +962,7 @@
         <w:pStyle w:val="FirstParagraph"/>
       </w:pPr>
       <w:r>
-        <w:t xml:space="preserve">A builder takes one brief through the change, commit, push, and pull request. Its process then</w:t>
-      </w:r>
-      <w:r>
-        <w:t xml:space="preserve"> </w:t>
-      </w:r>
-      <w:r>
-        <w:t xml:space="preserve">exits. It does not guess at missing requirements or wait for an answer.</w:t>
+        <w:t xml:space="preserve">A builder subagent takes one brief through the change, commit, push, and pull request. It then reports to its manager. It does not guess at missing requirements or wait for an answer.</w:t>
       </w:r>
     </w:p>
     <w:p>
@@ -1333,7 +1331,7 @@
         <w:pStyle w:val="BodyText"/>
       </w:pPr>
       <w:r>
-        <w:t xml:space="preserve">Conflicts still happen. A builder reports an unresolved problem to the console, which decides</w:t>
+        <w:t xml:space="preserve">Conflicts still happen. A builder reports an unresolved problem to the manager, which decides</w:t>
       </w:r>
       <w:r>
         <w:t xml:space="preserve"> </w:t>

</xml_diff>

<commit_message>
docs: distinguish subagent and standalone builder routes
</commit_message>
<xml_diff>
--- a/docs/word/KORUS.docx
+++ b/docs/word/KORUS.docx
@@ -268,7 +268,7 @@
         </w:numPr>
       </w:pPr>
       <w:r>
-        <w:t xml:space="preserve">A manager running one or more builder subagents, with a lander handling the merge queue.</w:t>
+        <w:t xml:space="preserve">A manager running one or more builders, as subagents or separate sessions, with a lander handling the merge queue.</w:t>
       </w:r>
     </w:p>
     <w:p>
@@ -928,7 +928,7 @@
         <w:pStyle w:val="BodyText"/>
       </w:pPr>
       <w:r>
-        <w:t xml:space="preserve">The manager is the session you talk to. It reads the project record and runs one or more builders as subagents.</w:t>
+        <w:t xml:space="preserve">The manager is the session you talk to. It reads the project record and runs one or more builders as subagents or separate sessions.</w:t>
       </w:r>
     </w:p>
     <w:p>
@@ -944,7 +944,15 @@
         <w:pStyle w:val="BodyText"/>
       </w:pPr>
       <w:r>
-        <w:t xml:space="preserve">A manager and its builders use one account. Several managers may share the repository, so their assigned paths must not conflict.</w:t>
+        <w:t xml:space="preserve">Subagents use the manager's account and return results directly. Separate sessions need an explicit route for questions and results.</w:t>
+      </w:r>
+    </w:p>
+    <w:p>
+      <w:pPr>
+        <w:pStyle w:val="BodyText"/>
+      </w:pPr>
+      <w:r>
+        <w:t xml:space="preserve">Several managers may share the repository, so their assigned paths must not conflict.</w:t>
       </w:r>
     </w:p>
     <w:bookmarkEnd w:id="32"/>
@@ -962,7 +970,7 @@
         <w:pStyle w:val="FirstParagraph"/>
       </w:pPr>
       <w:r>
-        <w:t xml:space="preserve">A builder subagent takes one brief through the change, commit, push, and pull request. It then reports to its manager. It does not guess at missing requirements or wait for an answer.</w:t>
+        <w:t xml:space="preserve">A builder takes one brief through the change, commit, push, and pull request. It then reports to its manager. It does not guess at missing requirements or wait for an answer.</w:t>
       </w:r>
     </w:p>
     <w:p>

</xml_diff>

<commit_message>
Replace the console build model with manager-led builders (#96)
* docs: replace console build model with manager subagents

* docs: distinguish subagent and standalone builder routes
</commit_message>
<xml_diff>
--- a/docs/word/KORUS.docx
+++ b/docs/word/KORUS.docx
@@ -268,7 +268,7 @@
         </w:numPr>
       </w:pPr>
       <w:r>
-        <w:t xml:space="preserve">A console to write briefs, a builder per brief, and a lander to manage the merge queue.</w:t>
+        <w:t xml:space="preserve">A manager running one or more builders, as subagents or separate sessions, with a lander handling the merge queue.</w:t>
       </w:r>
     </w:p>
     <w:p>
@@ -690,7 +690,7 @@
         <w:pStyle w:val="FirstParagraph"/>
       </w:pPr>
       <w:r>
-        <w:t xml:space="preserve">Ask Claude Code to create a project backlog and add new work as it comes up. Have the console use</w:t>
+        <w:t xml:space="preserve">Ask Claude Code to create a project backlog and add new work as it comes up. Have the manager use</w:t>
       </w:r>
       <w:r>
         <w:t xml:space="preserve"> </w:t>
@@ -729,7 +729,7 @@
         <w:t xml:space="preserve"> </w:t>
       </w:r>
       <w:r>
-        <w:t xml:space="preserve">requirement when you ask the console to make a plan.</w:t>
+        <w:t xml:space="preserve">requirement when you ask the manager to make a plan.</w:t>
       </w:r>
     </w:p>
     <w:p>
@@ -906,13 +906,13 @@
         <w:t xml:space="preserve">supplies the opening prompts, daily procedure, and recovery steps.</w:t>
       </w:r>
     </w:p>
-    <w:bookmarkStart w:id="32" w:name="Xa94288f7ae704dec490945374c87f7abe482367"/>
+    <w:bookmarkStart w:id="32" w:name="X4e7f8702c13f498de33df0b1ed8f3aa2b1af9f5"/>
     <w:p>
       <w:pPr>
         <w:pStyle w:val="Heading3"/>
       </w:pPr>
       <w:r>
-        <w:t xml:space="preserve">6.1 Console session</w:t>
+        <w:t xml:space="preserve">6.1 Manager session</w:t>
       </w:r>
     </w:p>
     <w:p>
@@ -920,27 +920,39 @@
         <w:pStyle w:val="FirstParagraph"/>
       </w:pPr>
       <w:r>
-        <w:t xml:space="preserve">The console is the session you talk to. It reads the project record, picks an item, writes a short</w:t>
-      </w:r>
-      <w:r>
-        <w:t xml:space="preserve"> </w:t>
-      </w:r>
-      <w:r>
-        <w:t xml:space="preserve">brief, and starts a builder.</w:t>
-      </w:r>
-    </w:p>
-    <w:p>
-      <w:pPr>
-        <w:pStyle w:val="BodyText"/>
-      </w:pPr>
-      <w:r>
-        <w:t xml:space="preserve">It polls for progress. If the brief leaves a question open, the builder writes that question back</w:t>
-      </w:r>
-      <w:r>
-        <w:t xml:space="preserve"> </w:t>
-      </w:r>
-      <w:r>
-        <w:t xml:space="preserve">and stops. The console then starts a fresh builder with a clearer brief.</w:t>
+        <w:t xml:space="preserve">The console was meant to oversee many parts of the build. It did not work, and the manager replaced it.</w:t>
+      </w:r>
+    </w:p>
+    <w:p>
+      <w:pPr>
+        <w:pStyle w:val="BodyText"/>
+      </w:pPr>
+      <w:r>
+        <w:t xml:space="preserve">The manager is the session you talk to. It reads the project record and runs one or more builders as subagents or separate sessions.</w:t>
+      </w:r>
+    </w:p>
+    <w:p>
+      <w:pPr>
+        <w:pStyle w:val="BodyText"/>
+      </w:pPr>
+      <w:r>
+        <w:t xml:space="preserve">Each builder gets a brief and its own worktree. The manager reads the results and resolves missing requirements before assigning more work.</w:t>
+      </w:r>
+    </w:p>
+    <w:p>
+      <w:pPr>
+        <w:pStyle w:val="BodyText"/>
+      </w:pPr>
+      <w:r>
+        <w:t xml:space="preserve">Subagents use the manager's account and return results directly. Separate sessions need an explicit route for questions and results.</w:t>
+      </w:r>
+    </w:p>
+    <w:p>
+      <w:pPr>
+        <w:pStyle w:val="BodyText"/>
+      </w:pPr>
+      <w:r>
+        <w:t xml:space="preserve">Several managers may share the repository, so their assigned paths must not conflict.</w:t>
       </w:r>
     </w:p>
     <w:bookmarkEnd w:id="32"/>
@@ -958,13 +970,7 @@
         <w:pStyle w:val="FirstParagraph"/>
       </w:pPr>
       <w:r>
-        <w:t xml:space="preserve">A builder takes one brief through the change, commit, push, and pull request. Its process then</w:t>
-      </w:r>
-      <w:r>
-        <w:t xml:space="preserve"> </w:t>
-      </w:r>
-      <w:r>
-        <w:t xml:space="preserve">exits. It does not guess at missing requirements or wait for an answer.</w:t>
+        <w:t xml:space="preserve">A builder takes one brief through the change, commit, push, and pull request. It then reports to its manager. It does not guess at missing requirements or wait for an answer.</w:t>
       </w:r>
     </w:p>
     <w:p>
@@ -1333,7 +1339,7 @@
         <w:pStyle w:val="BodyText"/>
       </w:pPr>
       <w:r>
-        <w:t xml:space="preserve">Conflicts still happen. A builder reports an unresolved problem to the console, which decides</w:t>
+        <w:t xml:space="preserve">Conflicts still happen. A builder reports an unresolved problem to the manager, which decides</w:t>
       </w:r>
       <w:r>
         <w:t xml:space="preserve"> </w:t>

</xml_diff>